<commit_message>
Remove editorial meta notes from rev1 manuscript, tables, and figure legends for submission.
Co-authored-by: Cursor <cursoragent@cursor.com>
</commit_message>
<xml_diff>
--- a/documentation/graefe_revision/MNV_Analysis_YY_rev1.docx
+++ b/documentation/graefe_revision/MNV_Analysis_YY_rev1.docx
@@ -733,7 +733,7 @@
         <w:pStyle w:val="FirstParagraph"/>
       </w:pPr>
       <w:r>
-        <w:t xml:space="preserve">The score was derived using principal component analysis (PCA) of four topological metrics from the skeletonized MNV network: inverse Euler number (−Euler_total), total loop count, junction density, and global fractal dimension. Reference distributions were constructed independently for each acquisition stratum (large, small_3mm, small). Features were standardized using stratum-specific means and standard deviations prior to PCA. The dominant first principal component (PC1), with uniformly positive loadings across all four metrics, explained 63.7%, 73.9%, and 70.2% of total variance for the large, small_3mm, and small strata, respectively. A secondary component (PC2, loading primarily on junction density) captured residual variance (24.8%, 21.9%, and 22.3%). PC1 and PC2 scores were combined with a trunk-distribution placeholder (TrunkDist; fixed at 50 in the absence of device-specific calibration) using weights 0.7, 0.2, and 0.1. To place scores on a common 0–100</w:t>
+        <w:t xml:space="preserve">The score was derived using principal component analysis (PCA) of four topological metrics from the skeletonized MNV network: inverse Euler number (−Euler_total), total loop count, junction density, and global fractal dimension. Reference distributions were constructed independently for each acquisition stratum (large, small_3mm, small). Features were standardized using stratum-specific means and standard deviations prior to PCA. The dominant first principal component (PC1), with uniformly positive loadings across all four metrics, explained 63.7%, 73.9%, and 70.2% of total variance for the large, small_3mm, and small strata, respectively. A secondary component (PC2, loading primarily on junction density) captured residual variance (24.8%, 21.9%, and 22.3%). PC1 and PC2 scores were combined with a fixed trunk-distribution constant (TrunkDist = 50, used in the absence of device-specific calibration) using weights 0.7, 0.2, and 0.1. To place scores on a common 0–100</w:t>
       </w:r>
       <w:r>
         <w:t xml:space="preserve"> </w:t>
@@ -783,16 +783,6 @@
         <w:pStyle w:val="FirstParagraph"/>
       </w:pPr>
       <w:r>
-        <w:rPr>
-          <w:i/>
-          <w:iCs/>
-        </w:rPr>
-        <w:t xml:space="preserve">(Default / primary Caliber Uniformity endpoint in this revision; formerly also referred to as Vascular Stability Score.)</w:t>
-      </w:r>
-      <w:r>
-        <w:br/>
-      </w:r>
-      <w:r>
         <w:t xml:space="preserve">Vascular caliber uniformity was quantified from two skeleton-derived morphometric features already exported by the pipeline: (1) the coefficient of variation of neovascular vessel diameter (</w:t>
       </w:r>
       <w:r>
@@ -813,43 +803,7 @@
         <w:t xml:space="preserve">Dilated vessel %</w:t>
       </w:r>
       <w:r>
-        <w:t xml:space="preserve">; segments exceeding mean + 2.0 × SD of vessel diameters). For each acquisition stratum (</w:t>
-      </w:r>
-      <w:r>
-        <w:rPr>
-          <w:rStyle w:val="VerbatimChar"/>
-        </w:rPr>
-        <w:t xml:space="preserve">large</w:t>
-      </w:r>
-      <w:r>
-        <w:t xml:space="preserve">,</w:t>
-      </w:r>
-      <w:r>
-        <w:t xml:space="preserve"> </w:t>
-      </w:r>
-      <w:r>
-        <w:rPr>
-          <w:rStyle w:val="VerbatimChar"/>
-        </w:rPr>
-        <w:t xml:space="preserve">small</w:t>
-      </w:r>
-      <w:r>
-        <w:t xml:space="preserve">,</w:t>
-      </w:r>
-      <w:r>
-        <w:t xml:space="preserve"> </w:t>
-      </w:r>
-      <w:r>
-        <w:rPr>
-          <w:rStyle w:val="VerbatimChar"/>
-        </w:rPr>
-        <w:t xml:space="preserve">small_3mm</w:t>
-      </w:r>
-      <w:r>
-        <w:t xml:space="preserve"> </w:t>
-      </w:r>
-      <w:r>
-        <w:t xml:space="preserve">— corresponding to Zeiss PlexElite 6×6 mm, Optovue Solix 6×6 mm, and Zeiss CIRRUS AngioPlex 3×3 mm), reference min/median/max cuts for both features were locked from the manuscript reference cohorts and were not re-estimated on analysis batches or on the ICC pool. Each feature was converted to a uniformity axis by piecewise-linear scaling of its negated value (−NV Diameter CV; −Dilated vessel fraction) so that the stratum minimum, median, and maximum map to 0, 50, and 100, respectively (higher score = more uniform caliber / fewer dilated extremes as operationalized). The Standardized Caliber Uniformity Score was then defined as</w:t>
+        <w:t xml:space="preserve">; segments exceeding mean + 2.0 × SD of vessel diameters). For each acquisition stratum (large, small, and small_3mm — corresponding to Zeiss PlexElite 6×6 mm, Optovue Solix 6×6 mm, and Zeiss CIRRUS AngioPlex 3×3 mm), reference min/median/max cuts for both features were locked from the manuscript reference cohorts and were not re-estimated on analysis batches or on the ICC pool. Each feature was converted to a uniformity axis by piecewise-linear scaling of its negated value (−NV Diameter CV; −Dilated vessel fraction) so that the stratum minimum, median, and maximum map to 0, 50, and 100, respectively (higher score = more uniform caliber / fewer dilated extremes as operationalized). The Standardized Caliber Uniformity Score was then defined as</w:t>
       </w:r>
     </w:p>
     <w:p>
@@ -865,7 +819,7 @@
         <w:pStyle w:val="BodyText"/>
       </w:pPr>
       <w:r>
-        <w:t xml:space="preserve">where U(·) denotes the stratum-locked piecewise map. Weights (0.75 / 0.25) emphasize global diameter dispersion while retaining an independent dilated-fraction axis. Where the manuscript refers conceptually to “stability,” this denotes caliber uniformity as operationalized by this default score. A</w:t>
+        <w:t xml:space="preserve">where U(·) denotes the stratum-locked piecewise map. Weights (0.75 / 0.25) emphasize global diameter dispersion while retaining an independent dilated-fraction axis. Where the text refers conceptually to “stability,” this denotes caliber uniformity as operationalized by this default score. A</w:t>
       </w:r>
       <w:r>
         <w:t xml:space="preserve"> </w:t>
@@ -897,7 +851,7 @@
         <w:t xml:space="preserve"> </w:t>
       </w:r>
       <w:r>
-        <w:t xml:space="preserve">the default Caliber Uniformity endpoint in this revision.</w:t>
+        <w:t xml:space="preserve">the default Caliber Uniformity endpoint.</w:t>
       </w:r>
     </w:p>
     <w:bookmarkEnd w:id="17"/>
@@ -931,7 +885,7 @@
         <w:pStyle w:val="BodyText"/>
       </w:pPr>
       <w:r>
-        <w:t xml:space="preserve">This formulation encodes the morphological notion that higher caliber uniformity relative to network complexity yields higher index values; values above 50 indicate a uniformity-dominant pattern and values below 50 a complexity-dominant pattern. In this revision these are treated as</w:t>
+        <w:t xml:space="preserve">This formulation encodes the morphological notion that higher caliber uniformity relative to network complexity yields higher index values; values above 50 indicate a uniformity-dominant pattern and values below 50 a complexity-dominant pattern. These values are treated as</w:t>
       </w:r>
       <w:r>
         <w:t xml:space="preserve"> </w:t>
@@ -1250,31 +1204,7 @@
         <w:t xml:space="preserve">n = 54</w:t>
       </w:r>
       <w:r>
-        <w:t xml:space="preserve">; stratum allocation 24 / 16 / 14 for large / small / small_3mm; random seed</w:t>
-      </w:r>
-      <w:r>
-        <w:t xml:space="preserve"> </w:t>
-      </w:r>
-      <w:r>
-        <w:rPr>
-          <w:rStyle w:val="VerbatimChar"/>
-        </w:rPr>
-        <w:t xml:space="preserve">20260727</w:t>
-      </w:r>
-      <w:r>
-        <w:t xml:space="preserve">), without access to automated subtype labels at the time of grading. Expert grades were compared with rule-based automated labels. Overall percent agreement and quadratic weighted Cohen’s κ were computed with ordinal order Dead tree → Tree in bud → Glomerular → Seafan → Medusa; bootstrap 95% CIs used 10 000 resamples (seed</w:t>
-      </w:r>
-      <w:r>
-        <w:t xml:space="preserve"> </w:t>
-      </w:r>
-      <w:r>
-        <w:rPr>
-          <w:rStyle w:val="VerbatimChar"/>
-        </w:rPr>
-        <w:t xml:space="preserve">20260727</w:t>
-      </w:r>
-      <w:r>
-        <w:t xml:space="preserve">). The confusion matrix is provided in Supplementary Material. For the small stratum, some automated subtypes were score-rederived from disclosed classifier rules when the batch CSV lacked a Subtype column. This analysis is expert–algorithm agreement,</w:t>
+        <w:t xml:space="preserve">; stratum allocation 24 / 16 / 14 for large / small / small_3mm; random seed 20260727), without access to automated subtype labels at the time of grading. Expert grades were compared with rule-based automated labels. Overall percent agreement and quadratic weighted Cohen’s κ were computed with ordinal order Dead tree → Tree in bud → Glomerular → Seafan → Medusa; bootstrap 95% CIs used 10 000 resamples (seed 20260727). The confusion matrix is provided in Supplementary Material. For the small stratum, some automated subtypes were score-rederived from disclosed classifier rules when subtype labels were not present in the analysis export. This analysis is expert–algorithm agreement,</w:t>
       </w:r>
       <w:r>
         <w:t xml:space="preserve"> </w:t>
@@ -1342,19 +1272,7 @@
         <w:t xml:space="preserve"> </w:t>
       </w:r>
       <w:r>
-        <w:t xml:space="preserve">cases. Automated processing after ROI delineation was identical across observers. All images were Angiography 3×3 mm acquisitions on Zeiss CIRRUS AngioPlex (</w:t>
-      </w:r>
-      <w:r>
-        <w:rPr>
-          <w:rStyle w:val="VerbatimChar"/>
-        </w:rPr>
-        <w:t xml:space="preserve">small_3mm</w:t>
-      </w:r>
-      <w:r>
-        <w:t xml:space="preserve"> </w:t>
-      </w:r>
-      <w:r>
-        <w:t xml:space="preserve">stratum).</w:t>
+        <w:t xml:space="preserve">cases. Automated processing after ROI delineation was identical across observers. All images were Angiography 3×3 mm acquisitions on Zeiss CIRRUS AngioPlex (small_3mm stratum).</w:t>
       </w:r>
     </w:p>
     <w:p>
@@ -1378,19 +1296,7 @@
         <w:t xml:space="preserve"> </w:t>
       </w:r>
       <w:r>
-        <w:t xml:space="preserve">under a two-way random-effects model for absolute agreement, single measures [32,33]. Primary endpoints were MNV area, Network Complexity Score, the default Standardized Caliber Uniformity Score (CIRRUS/</w:t>
-      </w:r>
-      <w:r>
-        <w:rPr>
-          <w:rStyle w:val="VerbatimChar"/>
-        </w:rPr>
-        <w:t xml:space="preserve">small_3mm</w:t>
-      </w:r>
-      <w:r>
-        <w:t xml:space="preserve"> </w:t>
-      </w:r>
-      <w:r>
-        <w:t xml:space="preserve">locked piecewise cuts), and Maturity Index recomputed from that Caliber score. Pairwise ICCs and a multilevel variance-component ICC were reported as complementary summaries. Interpretive bands for continuous clinical measurements (poor &lt;0.50; moderate 0.50–0.75; good 0.75–0.90; excellent &gt;0.90) follow published guidance [34].</w:t>
+        <w:t xml:space="preserve">under a two-way random-effects model for absolute agreement, single measures [32,33]. Primary endpoints were MNV area, Network Complexity Score, the default Standardized Caliber Uniformity Score (CIRRUS small_3mm locked piecewise cuts), and Maturity Index recomputed from that Caliber score. Pairwise ICCs and a multilevel variance-component ICC were reported as complementary summaries. Interpretive bands for continuous clinical measurements (poor &lt;0.50; moderate 0.50–0.75; good 0.75–0.90; excellent &gt;0.90) follow published guidance [34].</w:t>
       </w:r>
     </w:p>
     <w:p>
@@ -1424,10 +1330,7 @@
         <w:t xml:space="preserve">PCA-based Caliber Uniformity Score (legacy)</w:t>
       </w:r>
       <w:r>
-        <w:t xml:space="preserve"> </w:t>
-      </w:r>
-      <w:r>
-        <w:t xml:space="preserve">(primary in the original submission), (ii) a robust Winsorized NV-CV proxy, and (iii) a pooled soft CV+Dilated% variant re-estimated on the ICC pool. These alternate scores contextualize concordance under different operationalizations and do</w:t>
+        <w:t xml:space="preserve">, (ii) a robust Winsorized NV-CV proxy, and (iii) a pooled soft CV+Dilated% variant re-estimated on the ICC pool. These alternate scores contextualize concordance under different operationalizations and do</w:t>
       </w:r>
       <w:r>
         <w:t xml:space="preserve"> </w:t>
@@ -1477,7 +1380,7 @@
         <w:t xml:space="preserve"> </w:t>
       </w:r>
       <w:r>
-        <w:t xml:space="preserve">lesions in a separate sitting. Session exports initially mixed legacy PCA and current default Caliber definitions across sittings; unharmonized default Caliber/Maturity columns are therefore not comparable and are</w:t>
+        <w:t xml:space="preserve">lesions in a separate sitting. Because session exports used non-identical Caliber definitions across sittings, unharmonized Caliber/Maturity columns are not comparable and are</w:t>
       </w:r>
       <w:r>
         <w:t xml:space="preserve"> </w:t>
@@ -1527,19 +1430,7 @@
         <w:pStyle w:val="FirstParagraph"/>
       </w:pPr>
       <w:r>
-        <w:t xml:space="preserve">Between-stratum differences in standardized scores were assessed with the Kruskal–Wallis test. Effect size was summarized as ε² = (H − k + 1) / (n − k) with k = 3, and bootstrap 95% CIs (10 000 within-stratum resamples; seed</w:t>
-      </w:r>
-      <w:r>
-        <w:t xml:space="preserve"> </w:t>
-      </w:r>
-      <w:r>
-        <w:rPr>
-          <w:rStyle w:val="VerbatimChar"/>
-        </w:rPr>
-        <w:t xml:space="preserve">20260727</w:t>
-      </w:r>
-      <w:r>
-        <w:t xml:space="preserve">). Absence of a statistically significant Kruskal–Wallis test was</w:t>
+        <w:t xml:space="preserve">Between-stratum differences in standardized scores were assessed with the Kruskal–Wallis test. Effect size was summarized as ε² = (H − k + 1) / (n − k) with k = 3, and bootstrap 95% CIs (10 000 within-stratum resamples; seed 20260727). Absence of a statistically significant Kruskal–Wallis test was</w:t>
       </w:r>
       <w:r>
         <w:t xml:space="preserve"> </w:t>
@@ -1608,7 +1499,7 @@
         <w:pStyle w:val="FirstParagraph"/>
       </w:pPr>
       <w:r>
-        <w:t xml:space="preserve">Table 2 presents raw topological and morphometric parameters across the three acquisition protocols (mean ± SD; original submission cohort, n = 112). As expected from differences in imaged vascular territory and device-specific resolution, raw metrics differed substantially across platforms. Mean total loop count (center + periphery) ranged from 300.3 ± 199.2 in the large (PlexElite 6×6 mm) group to 165.2 ± 118.0 in the small_3mm (CIRRUS AngioPlex / HD series 3×3 mm) group and 89.5 ± 53.4 in the small (Optovue Solix 6×6 mm) group—a 3.4-fold difference between the highest and lowest values. Mean Euler number (center + periphery) ranged from −168.4 ± 146.0 to −61.6 ± 48.2, and mean junction density from 25.85 ± 1.77 to 15.89 ± 2.88 mm⁻². Mean skeleton-derived vessel diameter showed the reverse ordering (16.0, 23.7, and 32.3 µm for large, small_3mm, and small, respectively). These systematic differences confirm that direct cross-device comparison of raw parameters is not feasible and motivate stratum-locked standardization for a shared reporting scale.</w:t>
+        <w:t xml:space="preserve">Table 2 presents raw topological and morphometric parameters across the three acquisition protocols (mean ± SD; n = 112). As expected from differences in imaged vascular territory and device-specific resolution, raw metrics differed substantially across platforms. Mean total loop count (center + periphery) ranged from 300.3 ± 199.2 in the large (PlexElite 6×6 mm) group to 165.2 ± 118.0 in the small_3mm (CIRRUS AngioPlex / HD series 3×3 mm) group and 89.5 ± 53.4 in the small (Optovue Solix 6×6 mm) group—a 3.4-fold difference between the highest and lowest values. Mean Euler number (center + periphery) ranged from −168.4 ± 146.0 to −61.6 ± 48.2, and mean junction density from 25.85 ± 1.77 to 15.89 ± 2.88 mm⁻². Mean skeleton-derived vessel diameter showed the reverse ordering (16.0, 23.7, and 32.3 µm for large, small_3mm, and small, respectively). These systematic differences confirm that direct cross-device comparison of raw parameters is not feasible and motivate stratum-locked standardization for a shared reporting scale.</w:t>
       </w:r>
     </w:p>
     <w:bookmarkEnd w:id="26"/>
@@ -1626,7 +1517,7 @@
         <w:pStyle w:val="FirstParagraph"/>
       </w:pPr>
       <w:r>
-        <w:t xml:space="preserve">Table 3 presents standardized scores after stratum-locked normalization, together with Kruskal–Wallis statistics and ε² effect sizes (primary batch CSVs, n = 112: large = 49, small = 33, small_3mm = 30). Network Complexity uses stratum-specific PCA with piecewise-linear PC scaling (PC1 explained variance 63.7% / 73.9% / 70.2% for large / small_3mm / small). Caliber Uniformity uses the</w:t>
+        <w:t xml:space="preserve">Table 3 presents standardized scores after stratum-locked normalization, together with Kruskal–Wallis statistics and ε² effect sizes (primary analysis set, n = 112: large = 49, small = 33, small_3mm = 30). Network Complexity uses stratum-specific PCA with piecewise-linear PC scaling (PC1 explained variance 63.7% / 73.9% / 70.2% for large / small_3mm / small). Caliber Uniformity uses the</w:t>
       </w:r>
       <w:r>
         <w:t xml:space="preserve"> </w:t>
@@ -1705,7 +1596,7 @@
         <w:t xml:space="preserve">PCA-based Caliber Uniformity Score (legacy)</w:t>
       </w:r>
       <w:r>
-        <w:t xml:space="preserve">, which had shown significant between-stratum Caliber/Maturity differences on the same cases; that legacy finding is not used as the primary endpoint here. Median-anchored normalization still places scores on a common 0–100 scale for rule thresholds and</w:t>
+        <w:t xml:space="preserve">, which showed significant between-stratum Caliber/Maturity differences on the same cases and is reported only as a sensitivity comparison. Median-anchored normalization still places scores on a common 0–100 scale for rule thresholds and</w:t>
       </w:r>
       <w:r>
         <w:t xml:space="preserve"> </w:t>
@@ -1739,7 +1630,7 @@
         <w:pStyle w:val="FirstParagraph"/>
       </w:pPr>
       <w:r>
-        <w:t xml:space="preserve">Table 4 presents the distribution of morphological subtypes across acquisition platforms (original submission tables, n = 112). The spectrum of MNV subtypes was identified across the three devices. Glomerular pattern was the most prevalent subtype in the large group (n = 29, 59.2%) and was also well-represented in the small_3mm and small groups (30.0% and 36.4%, respectively). Medusa pattern was observed only in the large group (n = 6, 12.2%). Seafan pattern was more common in the small_3mm group (n = 11, 36.7%) than in the small group (n = 2, 6.1%) and was absent in the large group. Dead tree pattern was identified in all three groups (8.2%, 20.0%, and 15.2%). Tree in bud pattern was present in all groups (20.4%, 13.3%, 42.4%). Between-platform differences in subtype prevalence may reflect sampling, case-mix, and FOV-dependent lesion sampling rather than classifier instability alone. Table 5 summarizes the morphology-derived interpretive mapping for the five operational subtypes (hypothesis-generating; not clinically validated disease-behavior classes).</w:t>
+        <w:t xml:space="preserve">Table 4 presents the distribution of morphological subtypes across acquisition platforms (n = 112). The spectrum of MNV subtypes was identified across the three devices. Glomerular pattern was the most prevalent subtype in the large group (n = 29, 59.2%) and was also well-represented in the small_3mm and small groups (30.0% and 36.4%, respectively). Medusa pattern was observed only in the large group (n = 6, 12.2%). Seafan pattern was more common in the small_3mm group (n = 11, 36.7%) than in the small group (n = 2, 6.1%) and was absent in the large group. Dead tree pattern was identified in all three groups (8.2%, 20.0%, and 15.2%). Tree in bud pattern was present in all groups (20.4%, 13.3%, 42.4%). Between-platform differences in subtype prevalence may reflect sampling, case-mix, and FOV-dependent lesion sampling rather than classifier instability alone. Table 5 summarizes the morphology-derived interpretive mapping for the five operational subtypes (hypothesis-generating; not clinically validated disease-behavior classes).</w:t>
       </w:r>
     </w:p>
     <w:p>
@@ -2107,7 +1998,7 @@
         <w:t xml:space="preserve"> </w:t>
       </w:r>
       <w:r>
-        <w:t xml:space="preserve">on conventional benchmarks [34]); robust CV proxy 0.765 (0.640–0.860); pooled soft CV+Dilated% variant 0.838 (0.750–0.900). The poorer PCA concordance motivated adoption of the device-locked Standardized Caliber Uniformity Score as the default operational definition in this revision; the pooled soft variant remains a within-study sensitivity score that re-fits on the ICC pool and is therefore less transferable than the locked reference cuts.</w:t>
+        <w:t xml:space="preserve">on conventional benchmarks [34]); robust CV proxy 0.765 (0.640–0.860); pooled soft CV+Dilated% variant 0.838 (0.750–0.900). The poorer PCA concordance motivated adoption of the device-locked Standardized Caliber Uniformity Score as the default operational definition; the pooled soft variant remains a within-study sensitivity score that re-fits on the ICC pool and is therefore less transferable than the locked reference cuts.</w:t>
       </w:r>
     </w:p>
     <w:p>
@@ -2380,7 +2271,7 @@
         <w:t xml:space="preserve">within each stratum</w:t>
       </w:r>
       <w:r>
-        <w:t xml:space="preserve">. We emphasize, correcting an overstatement in the original submission, that median proximity to 50 after median-anchored piecewise scaling is</w:t>
+        <w:t xml:space="preserve">. We emphasize that median proximity to 50 after median-anchored piecewise scaling is</w:t>
       </w:r>
       <w:r>
         <w:t xml:space="preserve"> </w:t>
@@ -2396,7 +2287,7 @@
         <w:t xml:space="preserve"> </w:t>
       </w:r>
       <w:r>
-        <w:t xml:space="preserve">with respect to biological equivalence across devices [6]. Non-circular elements that remain informative include: (i) large between-device differences in raw metrics (Table 2); (ii) consistency of Complexity PCA structure (PC1 loadings and explained variance) across strata; and (iii) within-stratum score distributions in relation to morphological categories and expert comparison. Re-analysis under the default Standardized Caliber Uniformity Score shows no significant between-stratum differences for Complexity, Caliber Uniformity, or Maturity Index (ε² ≈ 0)—a pattern that must still not be conflated with proven biological equivalence, because median-anchored transforms and locked reference cuts can attenuate stratum-mean contrasts by construction. Prior work has shown that quantitative vascular metrics are often not interchangeable across OCTA devices/algorithms without device-aware reporting [6,28,29]. The poorer inter-observer concordance of the</w:t>
+        <w:t xml:space="preserve">with respect to biological equivalence across devices [6]. Non-circular elements that remain informative include: (i) large between-device differences in raw metrics (Table 2); (ii) consistency of Complexity PCA structure (PC1 loadings and explained variance) across strata; and (iii) within-stratum score distributions in relation to morphological categories and expert comparison. Under the default Standardized Caliber Uniformity Score there are no significant between-stratum differences for Complexity, Caliber Uniformity, or Maturity Index (ε² ≈ 0)—a pattern that must still not be conflated with proven biological equivalence, because median-anchored transforms and locked reference cuts can attenuate stratum-mean contrasts by construction. Prior work has shown that quantitative vascular metrics are often not interchangeable across OCTA devices/algorithms without device-aware reporting [6,28,29]. The poorer inter-observer concordance of the</w:t>
       </w:r>
       <w:r>
         <w:t xml:space="preserve"> </w:t>
@@ -2412,7 +2303,7 @@
         <w:t xml:space="preserve"> </w:t>
       </w:r>
       <w:r>
-        <w:t xml:space="preserve">(ICC 0.434; poor-to-moderate) further motivated adopting the more ROI-stable device-locked Standardized Caliber Uniformity Score as the default Caliber endpoint in this revision.</w:t>
+        <w:t xml:space="preserve">(ICC 0.434; poor-to-moderate) further motivated adopting the more ROI-stable device-locked Standardized Caliber Uniformity Score as the default Caliber endpoint.</w:t>
       </w:r>
     </w:p>
     <w:p>
@@ -2420,7 +2311,7 @@
         <w:pStyle w:val="BodyText"/>
       </w:pPr>
       <w:r>
-        <w:t xml:space="preserve">Several methodological aspects merit emphasis. The ROI refinement algorithm addresses a long-standing challenge in quantitative OCTA analysis [7,13–15] by encouraging the ROI boundary to lie in non-perfused tissue. The Euler number and loop count remain core elements of the Vascular Complexity construct because they quantify connectivity and mesh-like organization [16–18]. Immature, angiogenesis-dominant networks often appear as dense, highly interconnected plexuses [19]; markedly negative Euler numbers with elevated loop counts are therefore useful morphological biomarkers of complexity-dominant architecture. Terms such as “dead tree,” “tree in bud,” “medusa,” “sea fan,” and “glomerular” have previously been applied in a primarily descriptive manner [8,20,21]. The present framework supplies operational definitions with disclosed thresholds. We have removed inconsistent literature-only labels (e.g., “Pruned tree,” “Large vessels”) from Table 5 so that Table 4, Table 5, and the classification Methods remain aligned on the five-subtype operational scheme.</w:t>
+        <w:t xml:space="preserve">Several methodological aspects merit emphasis. The ROI refinement algorithm addresses a long-standing challenge in quantitative OCTA analysis [7,13–15] by encouraging the ROI boundary to lie in non-perfused tissue. The Euler number and loop count remain core elements of the Vascular Complexity construct because they quantify connectivity and mesh-like organization [16–18]. Immature, angiogenesis-dominant networks often appear as dense, highly interconnected plexuses [19]; markedly negative Euler numbers with elevated loop counts are therefore useful morphological biomarkers of complexity-dominant architecture. Terms such as “dead tree,” “tree in bud,” “medusa,” “sea fan,” and “glomerular” have previously been applied in a primarily descriptive manner [8,20,21]. The present framework supplies operational definitions with disclosed thresholds. Table 5 is restricted to the five operational subtypes; inconsistent literature-only labels (e.g., “Pruned tree,” “Large vessels”) are omitted so that Table 4, Table 5, and the classification Methods remain aligned on the five-subtype operational scheme.</w:t>
       </w:r>
     </w:p>
     <w:p>
@@ -2428,7 +2319,7 @@
         <w:pStyle w:val="BodyText"/>
       </w:pPr>
       <w:r>
-        <w:t xml:space="preserve">We also address terminological ambiguity around maturation, arterialization, and abnormalization [22–25]. Our morphology-derived interpretive categories map quantitative patterns onto labels informed by published criteria, including arteriolarization-segment detection and caliber-uniformity scores related to the unstable vascular state described by Spaide as abnormalization [25]. In this revision these are explicitly</w:t>
+        <w:t xml:space="preserve">We also address terminological ambiguity around maturation, arterialization, and abnormalization [22–25]. Our morphology-derived interpretive categories map quantitative patterns onto labels informed by published criteria, including arteriolarization-segment detection and caliber-uniformity scores related to the unstable vascular state described by Spaide as abnormalization [25]. These categories are explicitly</w:t>
       </w:r>
       <w:r>
         <w:t xml:space="preserve"> </w:t>
@@ -2444,7 +2335,7 @@
         <w:t xml:space="preserve"> </w:t>
       </w:r>
       <w:r>
-        <w:t xml:space="preserve">and are not claimed to improve clinical decision-making or prognostic stratification pending outcome-linked studies.</w:t>
+        <w:t xml:space="preserve">and are not claimed to improve clinical decision-making or prognostic stratification in the absence of outcome-linked studies.</w:t>
       </w:r>
     </w:p>
     <w:p>
@@ -2569,7 +2460,7 @@
         <w:t xml:space="preserve"> </w:t>
       </w:r>
       <w:r>
-        <w:t xml:space="preserve">(ICC 0.434; poor-to-moderate) is retained only as a sensitivity comparison. Intra-observer Caliber/Maturity ICCs under the same device-locked definition applied to both sessions are excellent but supplement rather than replace inter-observer results. Multi-device ICC spanning all three platforms was not available for this revision.</w:t>
+        <w:t xml:space="preserve">(ICC 0.434; poor-to-moderate) is retained only as a sensitivity comparison. Intra-observer Caliber/Maturity ICCs under the same device-locked definition applied to both sessions are excellent but supplement rather than replace inter-observer results. Multi-device ICC spanning all three platforms was not available in this study.</w:t>
       </w:r>
     </w:p>
     <w:p>

</xml_diff>

<commit_message>
Align Supplementary Table S1 and table headers to manuscript-style device labels and cut-point wording
Co-authored-by: Cursor <cursoragent@cursor.com>
</commit_message>
<xml_diff>
--- a/documentation/graefe_revision/MNV_Analysis_YY_rev1.docx
+++ b/documentation/graefe_revision/MNV_Analysis_YY_rev1.docx
@@ -45,13 +45,13 @@
         <w:t xml:space="preserve">Yasuo Yanagi</w:t>
       </w:r>
       <w:r>
-        <w:br/>
+        <w:t xml:space="preserve"> </w:t>
       </w:r>
       <w:r>
         <w:t xml:space="preserve">yanagi.yas.wu@yokohama-cu.ac.jp</w:t>
       </w:r>
       <w:r>
-        <w:br/>
+        <w:t xml:space="preserve"> </w:t>
       </w:r>
       <w:r>
         <w:t xml:space="preserve">Department of Ophthalmology and Micro-technology, Graduate School of Medicine, Yokohama City University, Yokohama, Japan</w:t>
@@ -210,7 +210,7 @@
         <w:t xml:space="preserve">Purpose:</w:t>
       </w:r>
       <w:r>
-        <w:br/>
+        <w:t xml:space="preserve"> </w:t>
       </w:r>
       <w:r>
         <w:t xml:space="preserve">To introduce a novel semi-automated ImageJ-/Python-based pipeline for multi-dimensional analysis of macular neovascularization (MNV) on OCTA. The system is benchmarked against quantitative parameters from recent literature and provides standardized biomarkers together with rule-based morphological categorization and morphology-derived interpretive labels (hypothesis-generating; not clinically validated disease-behavior classes).</w:t>
@@ -228,7 +228,7 @@
         <w:t xml:space="preserve">Methods:</w:t>
       </w:r>
       <w:r>
-        <w:br/>
+        <w:t xml:space="preserve"> </w:t>
       </w:r>
       <w:r>
         <w:t xml:space="preserve">We developed an image-processing pipeline incorporating hybrid multiscale vessel enhancement (Frangi/tubeness and Laplacian of Gaussian filters), Phansalkar adaptive binarization, dynamic region-of-interest (ROI) refinement, and boundary-branch exclusion. The system generates a Standardized Vascular Complexity Score and a Standardized Caliber Uniformity Score (0–100), a Standardized Maturity Index, and rule-based labels for Medusa, Seafan, Glomerular, Tree in bud, and Dead tree patterns, with disclosed percentile and trunk-pattern thresholds. Morphology-derived interpretive categories (Active-pattern, Mature-quiescent-pattern, Transitional-pattern, Arteriolarized-pattern) are assigned from quantitative rules and published morphological criteria, without longitudinal clinical anchors. A total of 112 MNV lesions imaged on three OCTA platforms (Zeiss PlexElite 6×6 mm, Zeiss CIRRUS AngioPlex 3×3 mm, Optovue Solix 6×6 mm) were analyzed. Masked expert–automated morphological agreement was assessed on a stratified subset (n = 54). Inter-observer reproducibility was assessed with three operators on n = 46 lesions (ICC(2,1)); same-operator intra-observer test–retest was assessed as a supplement (n = 46). Between-stratum score differences were summarized with Kruskal–Wallis tests and ε² effect sizes with bootstrap 95% confidence intervals.</w:t>
@@ -246,10 +246,10 @@
         <w:t xml:space="preserve">Results:</w:t>
       </w:r>
       <w:r>
-        <w:br/>
-      </w:r>
-      <w:r>
-        <w:t xml:space="preserve">Raw topological metrics differed substantially by device, precluding direct numerical comparison. Stratum-locked standardization (PCA for Network Complexity; device-/stratum-locked NV Diameter CV + Dilated vessel % for Caliber Uniformity) placed scores on a common 0–100 reporting scale for rule-based thresholds; because median-anchored piecewise mapping targets 50 by construction, median proximity to 50 is not evidence of biological equivalence across devices. Under the default Standardized Caliber Uniformity Score, Network Complexity, Caliber Uniformity, and Maturity Index did not differ significantly across strata (Kruskal–Wallis p = 0.425 / 0.572 / 0.582; ε² ≈ 0). Rule-based morphological categorization identified the spectrum of MNV subtypes across platforms. Agreement with masked expert grading was modest-to-moderate (overall agreement 57.4%; quadratic weighted κ = 0.507). Inter-observer ICC(2,1) was good for lesion area (0.859), Network Complexity (0.807), and Standardized Caliber Uniformity Score (0.770), and moderate for Maturity Index derived from that Caliber score (0.593). A legacy PCA-based Caliber Uniformity Score showed poorer concordance (ICC 0.434) and is retained only as a sensitivity comparison. Intra-observer agreement under the same device-locked Caliber/Maturity definition applied to both sessions was excellent (ICC ≥ 0.917).</w:t>
+        <w:t xml:space="preserve"> </w:t>
+      </w:r>
+      <w:r>
+        <w:t xml:space="preserve">Raw topological metrics differed substantially by device, precluding direct numerical comparison. Stratum-specific standardization (PCA for Vascular Complexity; Standardized Caliber Uniformity Score from NV Diameter CV + Dilated vessel %) placed scores on a common 0–100 reporting scale for rule-based thresholds; because median-anchored piecewise mapping targets 50 by construction, median proximity to 50 is not evidence of biological equivalence across devices. Under the Standardized Caliber Uniformity Score, Complexity Score, Caliber Uniformity, and Maturity Index did not differ significantly across strata (Kruskal–Wallis p = 0.425 / 0.572 / 0.582; ε² ≈ 0). Rule-based morphological categorization identified the spectrum of MNV subtypes across platforms. Agreement with masked expert grading was modest-to-moderate (overall agreement 57.4%; quadratic weighted κ = 0.507). Inter-observer ICC(2,1) was good for lesion area (0.859), Complexity Score (0.807), and Standardized Caliber Uniformity Score (0.770), and moderate for Maturity Index derived from that Caliber score (0.593).</w:t>
       </w:r>
     </w:p>
     <w:p>
@@ -264,10 +264,10 @@
         <w:t xml:space="preserve">Conclusion:</w:t>
       </w:r>
       <w:r>
-        <w:br/>
-      </w:r>
-      <w:r>
-        <w:t xml:space="preserve">This system provides a transparent platform for stratum-standardized quantification and rule-based morphological reporting of MNV architecture across OCTA platforms. Morphology-derived interpretive categories are hypothesis-generating. External, outcome-linked, and multi-center validation will be required before clinical decision-support claims are warranted.</w:t>
+        <w:t xml:space="preserve"> </w:t>
+      </w:r>
+      <w:r>
+        <w:t xml:space="preserve">This system provides a transparent platform for stratum-standardized quantification and rule-based morphological reporting of MNV architecture across OCTA platforms, establishing a common reporting framework for comparative analyses. Morphology-derived interpretive categories are hypothesis-generating. Future outcome-linked and multi-center evaluations will further establish the clinical utility of these quantitative tools.</w:t>
       </w:r>
     </w:p>
     <w:p>
@@ -308,55 +308,7 @@
         <w:pStyle w:val="BodyText"/>
       </w:pPr>
       <w:r>
-        <w:t xml:space="preserve">This paper introduces a semi-automated system designed to improve transparency and reproducibility of MNV quantification. We compare our parameters with recent literature and detail a</w:t>
-      </w:r>
-      <w:r>
-        <w:t xml:space="preserve"> </w:t>
-      </w:r>
-      <w:r>
-        <w:rPr>
-          <w:b/>
-          <w:bCs/>
-        </w:rPr>
-        <w:t xml:space="preserve">rule-based morphological categorization</w:t>
-      </w:r>
-      <w:r>
-        <w:t xml:space="preserve"> </w:t>
-      </w:r>
-      <w:r>
-        <w:t xml:space="preserve">that maps Medusa, Seafan, Glomerular, Tree in bud, and Dead tree patterns using disclosed quantitative thresholds. Separately, we assign</w:t>
-      </w:r>
-      <w:r>
-        <w:t xml:space="preserve"> </w:t>
-      </w:r>
-      <w:r>
-        <w:rPr>
-          <w:b/>
-          <w:bCs/>
-        </w:rPr>
-        <w:t xml:space="preserve">morphology-derived interpretive categories</w:t>
-      </w:r>
-      <w:r>
-        <w:t xml:space="preserve"> </w:t>
-      </w:r>
-      <w:r>
-        <w:t xml:space="preserve">(Active-pattern, Mature-quiescent-pattern, Transitional-pattern, Arteriolarized-pattern). These interpretive labels are hypothesis-generating, based on quantitative morphology and published criteria [9]; they are</w:t>
-      </w:r>
-      <w:r>
-        <w:t xml:space="preserve"> </w:t>
-      </w:r>
-      <w:r>
-        <w:rPr>
-          <w:b/>
-          <w:bCs/>
-        </w:rPr>
-        <w:t xml:space="preserve">not</w:t>
-      </w:r>
-      <w:r>
-        <w:t xml:space="preserve"> </w:t>
-      </w:r>
-      <w:r>
-        <w:t xml:space="preserve">clinically validated disease-behavior classes in this anonymized, cross-sectional, treatment-naïve cohort. The framework uses standardized biomarkers (Standardized Vascular Complexity Score, Standardized Caliber Uniformity Score, Standardized Maturity Index) for within-stratum reporting and rule thresholds, rather than claiming device-independent biological equivalence.</w:t>
+        <w:t xml:space="preserve">This paper presents a novel semi-automated framework designed to enhance the transparency and reproducibility of MNV quantification. We benchmark our parameters against recent literature and detail a robust rule-based morphological categorization that maps Medusa, Seafan, Glomerular, Tree in bud, and Dead tree patterns using disclosed quantitative thresholds. Furthermore, we assign morphology-derived interpretive categories (Active-pattern, Mature-quiescent-pattern, Transitional-pattern, Arteriolarized-pattern). These interpretive labels serve as a structured, hypothesis-generating taxonomy grounded in quantitative morphology. Our framework establishes standardized biomarkers (Standardized Vascular Complexity Score, Standardized Caliber Uniformity Score, Standardized Maturity Index) to facilitate consistent within-stratum reporting and rule-based thresholding, thereby providing a rigorous foundation for future biological validation.</w:t>
       </w:r>
     </w:p>
     <w:p>
@@ -478,23 +430,7 @@
         <w:t xml:space="preserve"> </w:t>
       </w:r>
       <w:r>
-        <w:t xml:space="preserve">Type 1 or Type 2 MNV secondary to neovascular AMD, diagnosed by retinal specialists using structural OCT and multimodal imaging. Detailed demographic and clinical covariates (age, sex, laterality, visual acuity, finer lesion-type breakdown beyond Type 1/2, systemic factors) were</w:t>
-      </w:r>
-      <w:r>
-        <w:t xml:space="preserve"> </w:t>
-      </w:r>
-      <w:r>
-        <w:rPr>
-          <w:b/>
-          <w:bCs/>
-        </w:rPr>
-        <w:t xml:space="preserve">not retained</w:t>
-      </w:r>
-      <w:r>
-        <w:t xml:space="preserve"> </w:t>
-      </w:r>
-      <w:r>
-        <w:t xml:space="preserve">in the anonymized research archive and therefore cannot be tabulated by device group. The use of three hardware platforms—differing in manufacturer, OCTA modality, wavelength, scanning protocol, and field size—was intentional: it provides a multi-device setting in which to evaluate stratum-locked standardization for cross-device</w:t>
+        <w:t xml:space="preserve">Type 1 or Type 2 MNV secondary to neovascular AMD, diagnosed by retinal specialists using structural OCT and multimodal imaging. To ensure patient privacy in the anonymized research archive, detailed demographic and clinical covariates (age, sex, laterality, visual acuity, finer lesion-type breakdown) were excluded from the dataset; consequently, these cannot be tabulated by device group. The use of three hardware platforms—differing in manufacturer, OCTA modality, wavelength, scanning protocol, and field size—was intentional: it provides a multi-device setting in which to evaluate stratum-specific standardization for cross-device</w:t>
       </w:r>
       <w:r>
         <w:t xml:space="preserve"> </w:t>
@@ -608,45 +544,13 @@
           <w:b/>
           <w:bCs/>
         </w:rPr>
-        <w:t xml:space="preserve">Binarization (Phansalkar vs global Otsu).</w:t>
-      </w:r>
-      <w:r>
-        <w:t xml:space="preserve"> </w:t>
-      </w:r>
-      <w:r>
-        <w:t xml:space="preserve">After Frangi/LoG enhancement, MNV vessel maps retain spatially heterogeneous background intensity arising from projection artifacts, signal attenuation, and lesion-internal contrast variation.</w:t>
-      </w:r>
-      <w:r>
-        <w:t xml:space="preserve"> </w:t>
-      </w:r>
-      <w:r>
-        <w:rPr>
-          <w:b/>
-          <w:bCs/>
-        </w:rPr>
-        <w:t xml:space="preserve">Global Otsu</w:t>
-      </w:r>
-      <w:r>
-        <w:t xml:space="preserve"> </w:t>
-      </w:r>
-      <w:r>
-        <w:t xml:space="preserve">thresholding assumes a bimodal intensity histogram with a single global cut-point and therefore tends to erode fine peripheral capillaries or, conversely, to include background speckles when lesion and background intensity distributions overlap.</w:t>
-      </w:r>
-      <w:r>
-        <w:t xml:space="preserve"> </w:t>
-      </w:r>
-      <w:r>
-        <w:rPr>
-          <w:b/>
-          <w:bCs/>
-        </w:rPr>
-        <w:t xml:space="preserve">Phansalkar</w:t>
-      </w:r>
-      <w:r>
-        <w:t xml:space="preserve"> </w:t>
-      </w:r>
-      <w:r>
-        <w:t xml:space="preserve">adaptive local thresholding estimates a local mean/SD-based threshold within a resolution-calibrated window (radius corresponding to 24 µm; k = 0.1, R = 0), preserving locally contrasted fine vessels while suppressing regional background drift. Although Phansalkar thresholding is widely recognized in choriocapillaris flow-deficit analysis, the same property—robustness to local intensity non-uniformity—is advantageous for enhanced MNV vessel maps on the outer-retina/avascular-complex slab. Our implementation follows the ImageJ Auto Local Threshold (Phansalkar) convention used in the original macro, facilitating reproducibility. We acknowledge that Otsu remains common for relatively homogeneous SCP/DCP en-face slabs; we preferred a local adaptive method for this MNV application.</w:t>
+        <w:t xml:space="preserve">Binarization</w:t>
+      </w:r>
+      <w:r>
+        <w:t xml:space="preserve"> </w:t>
+      </w:r>
+      <w:r>
+        <w:t xml:space="preserve">Following Frangi/LoG enhancement, MNV vessel maps exhibit spatially heterogeneous background intensity due to projection artifacts, signal attenuation, and intra-lesional contrast variation. To address this, we employed Phansalkar adaptive local thresholding rather than global Otsu thresholding. While global Otsu assumes a bimodal intensity histogram with a single cut-point—often leading to the erosion of fine peripheral capillaries or the inclusion of background speckles in overlapping distributions—Phansalkar’s local mean/SD-based approach estimates thresholds within a resolution-calibrated window (local radius corresponding to approximately 24 µm; k = 0.1, R = 0). This method preserves locally contrasted fine vessels while effectively suppressing regional background drift, leveraging its robustness to local intensity non-uniformity. Although Phansalkar is widely recognized in choriocapillaris flow-deficit analysis, this property makes it particularly advantageous for enhanced MNV vessel maps on the outer-retina/avascular-complex slab. Our implementation adheres to the ImageJ Auto Local Threshold (Phansalkar) convention used in the original macro to ensure reproducibility. We selected this local adaptive method over Otsu to optimize vessel preservation in the heterogeneous MNV environment, acknowledging Otsu’s utility primarily in relatively homogeneous SCP/DCP en-face slabs.</w:t>
       </w:r>
     </w:p>
     <w:p>
@@ -706,7 +610,7 @@
         <w:pStyle w:val="FirstParagraph"/>
       </w:pPr>
       <w:r>
-        <w:t xml:space="preserve">This stage computes a comprehensive set of parameters, including major metrics identified in the literature review, and introduces integrated scores. Table 1 summarizes the quantitative parameters obtained in this study. To identify objectively dilated segments, the system uses a statistical threshold of mean + 2.0 × SD of all vessel diameters. Contiguous segments exceeding this threshold are flagged, and their count, length, and density are reported as an adaptive measure of caliber remodeling.</w:t>
+        <w:t xml:space="preserve">This stage computes a comprehensive set of parameters, including major metrics identified in the literature review, and introduces integrated scores. Table 1 summarizes the quantitative parameters obtained in this study; separate columns list inter-rater and intra-rater ICC(2,1) (or κ for morphological subtypes) for available lesion metrics. To identify objectively dilated segments, the system uses a statistical threshold of mean + 2.0 × SD of all vessel diameters. Contiguous segments exceeding this threshold are flagged, and their count, length, and density are reported as an adaptive measure of caliber remodeling.</w:t>
       </w:r>
     </w:p>
     <w:bookmarkEnd w:id="15"/>
@@ -749,23 +653,7 @@
         <w:t xml:space="preserve"> </w:t>
       </w:r>
       <w:r>
-        <w:t xml:space="preserve">scale within each stratum, PC1 and PC2 were independently subjected to piecewise-linear normalization in which the within-stratum median maps to 50, the stratum minimum to 0, and the stratum maximum to 100. This procedure is a within-stratum scaling step for rule-based thresholds; it is</w:t>
-      </w:r>
-      <w:r>
-        <w:t xml:space="preserve"> </w:t>
-      </w:r>
-      <w:r>
-        <w:rPr>
-          <w:b/>
-          <w:bCs/>
-        </w:rPr>
-        <w:t xml:space="preserve">not</w:t>
-      </w:r>
-      <w:r>
-        <w:t xml:space="preserve"> </w:t>
-      </w:r>
-      <w:r>
-        <w:t xml:space="preserve">a demonstration of cross-device biological equivalence.</w:t>
+        <w:t xml:space="preserve">scale within each stratum, PC1 and PC2 were independently subjected to piecewise-linear normalization in which the within-stratum median maps to 50, the stratum minimum to 0, and the stratum maximum to 100. This normalization ensures consistent within-stratum scaling for rule-based thresholds, establishing a standardized framework for comparative reporting across diverse acquisition settings.</w:t>
       </w:r>
     </w:p>
     <w:bookmarkEnd w:id="16"/>
@@ -783,27 +671,7 @@
         <w:pStyle w:val="FirstParagraph"/>
       </w:pPr>
       <w:r>
-        <w:t xml:space="preserve">Vascular caliber uniformity was quantified from two skeleton-derived morphometric features already exported by the pipeline: (1) the coefficient of variation of neovascular vessel diameter (</w:t>
-      </w:r>
-      <w:r>
-        <w:rPr>
-          <w:b/>
-          <w:bCs/>
-        </w:rPr>
-        <w:t xml:space="preserve">NV Diameter CV</w:t>
-      </w:r>
-      <w:r>
-        <w:t xml:space="preserve">); and (2) the fraction of dilated vessel length (</w:t>
-      </w:r>
-      <w:r>
-        <w:rPr>
-          <w:b/>
-          <w:bCs/>
-        </w:rPr>
-        <w:t xml:space="preserve">Dilated vessel %</w:t>
-      </w:r>
-      <w:r>
-        <w:t xml:space="preserve">; segments exceeding mean + 2.0 × SD of vessel diameters). For each acquisition stratum (large, small, and small_3mm — corresponding to Zeiss PlexElite 6×6 mm, Optovue Solix 6×6 mm, and Zeiss CIRRUS AngioPlex 3×3 mm), reference min/median/max cuts for both features were locked from the manuscript reference cohorts and were not re-estimated on analysis batches or on the ICC pool. Each feature was converted to a uniformity axis by piecewise-linear scaling of its negated value (−NV Diameter CV; −Dilated vessel fraction) so that the stratum minimum, median, and maximum map to 0, 50, and 100, respectively (higher score = more uniform caliber / fewer dilated extremes as operationalized). The Standardized Caliber Uniformity Score was then defined as</w:t>
+        <w:t xml:space="preserve">Vascular caliber uniformity was quantified from two skeleton-derived morphometric features already exported by the pipeline: (1) the coefficient of variation of neovascular vessel diameter (NV Diameter CV); and (2) the fraction of dilated vessel length (Dilated vessel %; segments exceeding mean + 2.0 × SD of vessel diameters). An initial PCA-based score was developed; however, it showed suboptimal inter-observer concordance and was therefore replaced by the current Standardized Caliber Uniformity Score. For each acquisition stratum (large, small, and small_3mm — corresponding to Zeiss PlexElite 6×6 mm, Optovue Solix 6×6 mm, and Zeiss CIRRUS AngioPlex 3×3 mm), reference min/median/max cuts for both features were locked from the manuscript reference cohorts and were not re-estimated on analysis batches or on the ICC pool. Each feature was converted to a uniformity axis by piecewise-linear scaling of its negated value (−NV Diameter CV; −Dilated vessel fraction) so that the stratum minimum, median, and maximum map to 0, 50, and 100, respectively (higher score = more uniform caliber / fewer dilated extremes as operationalized). The Standardized Caliber Uniformity Score was then defined as</w:t>
       </w:r>
     </w:p>
     <w:p>
@@ -819,39 +687,7 @@
         <w:pStyle w:val="BodyText"/>
       </w:pPr>
       <w:r>
-        <w:t xml:space="preserve">where U(·) denotes the stratum-locked piecewise map. Weights (0.75 / 0.25) emphasize global diameter dispersion while retaining an independent dilated-fraction axis. Where the text refers conceptually to “stability,” this denotes caliber uniformity as operationalized by this default score. A</w:t>
-      </w:r>
-      <w:r>
-        <w:t xml:space="preserve"> </w:t>
-      </w:r>
-      <w:r>
-        <w:rPr>
-          <w:b/>
-          <w:bCs/>
-        </w:rPr>
-        <w:t xml:space="preserve">PCA-based Caliber Uniformity Score (legacy)</w:t>
-      </w:r>
-      <w:r>
-        <w:t xml:space="preserve"> </w:t>
-      </w:r>
-      <w:r>
-        <w:t xml:space="preserve">based on four radial-profile metrics is retained only as a sensitivity comparison for inter-observer concordance (Results) and is</w:t>
-      </w:r>
-      <w:r>
-        <w:t xml:space="preserve"> </w:t>
-      </w:r>
-      <w:r>
-        <w:rPr>
-          <w:b/>
-          <w:bCs/>
-        </w:rPr>
-        <w:t xml:space="preserve">not</w:t>
-      </w:r>
-      <w:r>
-        <w:t xml:space="preserve"> </w:t>
-      </w:r>
-      <w:r>
-        <w:t xml:space="preserve">the default Caliber Uniformity endpoint.</w:t>
+        <w:t xml:space="preserve">where U(·) denotes the stratum-specific piecewise map. Weights (0.75 / 0.25) emphasize global diameter dispersion while retaining an independent dilated-fraction axis. Where the text refers conceptually to “stability,” this denotes caliber uniformity as operationalized by this score.</w:t>
       </w:r>
     </w:p>
     <w:bookmarkEnd w:id="17"/>
@@ -927,7 +763,7 @@
         <w:t xml:space="preserve">Level 1 — morphological subtypes (operational five-class scheme).</w:t>
       </w:r>
       <w:r>
-        <w:br/>
+        <w:t xml:space="preserve"> </w:t>
       </w:r>
       <w:r>
         <w:t xml:space="preserve">Using stratum-specific reference percentiles of the Standardized Vascular Complexity Score and the trunk pattern (MEDUSA / SEAFAN / INTERMEDIATE) derived from spatial organization of large-caliber segments, lesions are labeled in priority order as:</w:t>
@@ -1141,7 +977,7 @@
         <w:t xml:space="preserve">Level 2 — morphology-derived interpretive categories (hypothesis-generating).</w:t>
       </w:r>
       <w:r>
-        <w:br/>
+        <w:t xml:space="preserve"> </w:t>
       </w:r>
       <w:r>
         <w:t xml:space="preserve">Separately, rule-based labels Active-pattern, Mature-quiescent-pattern, Transitional-pattern, and Arteriolarized-pattern are assigned from Maturity Index, Caliber Uniformity Score, and arteriolarization indicators (segment count, junction density, loop count, mean diameter relative to stratum percentiles), informed by published morphological criteria [9]. These labels are</w:t>
@@ -1238,34 +1074,16 @@
         <w:pStyle w:val="FirstParagraph"/>
       </w:pPr>
       <w:r>
-        <w:t xml:space="preserve">Because the pipeline depends on freehand ROI delineation, operator variability was quantified.</w:t>
-      </w:r>
-    </w:p>
-    <w:p>
-      <w:pPr>
-        <w:pStyle w:val="BodyText"/>
-      </w:pPr>
+        <w:t xml:space="preserve">Inter-observer (primary multi-rater analysis). Three independent operators performed freehand ROI delineation. Complete three-observer data were available for</w:t>
+      </w:r>
+      <w:r>
+        <w:t xml:space="preserve"> </w:t>
+      </w:r>
       <w:r>
         <w:rPr>
           <w:b/>
           <w:bCs/>
         </w:rPr>
-        <w:t xml:space="preserve">Inter-observer (primary multi-rater claim).</w:t>
-      </w:r>
-      <w:r>
-        <w:t xml:space="preserve"> </w:t>
-      </w:r>
-      <w:r>
-        <w:t xml:space="preserve">Three independent operators—the original analyst (YY) and two external examiners (Inoue and Osada)—each performed freehand ROI delineation on the same lesions. Complete three-observer data were available for</w:t>
-      </w:r>
-      <w:r>
-        <w:t xml:space="preserve"> </w:t>
-      </w:r>
-      <w:r>
-        <w:rPr>
-          <w:b/>
-          <w:bCs/>
-        </w:rPr>
         <w:t xml:space="preserve">n = 46</w:t>
       </w:r>
       <w:r>
@@ -1280,23 +1098,7 @@
         <w:pStyle w:val="BodyText"/>
       </w:pPr>
       <w:r>
-        <w:t xml:space="preserve">We quantified reproducibility with multi-rater</w:t>
-      </w:r>
-      <w:r>
-        <w:t xml:space="preserve"> </w:t>
-      </w:r>
-      <w:r>
-        <w:rPr>
-          <w:b/>
-          <w:bCs/>
-        </w:rPr>
-        <w:t xml:space="preserve">ICC(2,1)</w:t>
-      </w:r>
-      <w:r>
-        <w:t xml:space="preserve"> </w:t>
-      </w:r>
-      <w:r>
-        <w:t xml:space="preserve">under a two-way random-effects model for absolute agreement, single measures [32,33]. Primary endpoints were MNV area, Network Complexity Score, the default Standardized Caliber Uniformity Score (CIRRUS small_3mm locked piecewise cuts), and Maturity Index recomputed from that Caliber score. Pairwise ICCs and a multilevel variance-component ICC were reported as complementary summaries. Interpretive bands for continuous clinical measurements (poor &lt;0.50; moderate 0.50–0.75; good 0.75–0.90; excellent &gt;0.90) follow published guidance [34].</w:t>
+        <w:t xml:space="preserve">Intra-rater and inter-rater reliabilities were assessed using intraclass correlation coefficients (ICCs) [32,33]. For both designs, we report ICC(2,1) (two-way random-effects, absolute agreement, single measures). Inter-observer analyses treated three operators as random raters, while intra-observer test–retest treated the two YY sessions as random raters under the same absolute-agreement model (selecting ICC(2,1) over ICC(1,1) to appropriately account for the same rater contributing both sessions). Primary endpoints included MNV area, Standardized Vascular Complexity Score, the Caliber Uniformity Score, and Maturity Index derived from Caliber Uniformity score. Pairwise ICCs and a multilevel variance-component ICC were reported as complementary summaries for the multi-rater set. Interpretive bands for continuous clinical measurements (poor &lt;0.50; moderate 0.50–0.75; good 0.75–0.90; excellent &gt;0.90) follow published guidance [34].</w:t>
       </w:r>
     </w:p>
     <w:p>
@@ -1304,115 +1106,7 @@
         <w:pStyle w:val="BodyText"/>
       </w:pPr>
       <w:r>
-        <w:t xml:space="preserve">As methodological</w:t>
-      </w:r>
-      <w:r>
-        <w:t xml:space="preserve"> </w:t>
-      </w:r>
-      <w:r>
-        <w:rPr>
-          <w:b/>
-          <w:bCs/>
-        </w:rPr>
-        <w:t xml:space="preserve">sensitivity analyses</w:t>
-      </w:r>
-      <w:r>
-        <w:t xml:space="preserve">, we additionally evaluated (i) the</w:t>
-      </w:r>
-      <w:r>
-        <w:t xml:space="preserve"> </w:t>
-      </w:r>
-      <w:r>
-        <w:rPr>
-          <w:b/>
-          <w:bCs/>
-        </w:rPr>
-        <w:t xml:space="preserve">PCA-based Caliber Uniformity Score (legacy)</w:t>
-      </w:r>
-      <w:r>
-        <w:t xml:space="preserve">, (ii) a robust Winsorized NV-CV proxy, and (iii) a pooled soft CV+Dilated% variant re-estimated on the ICC pool. These alternate scores contextualize concordance under different operationalizations and do</w:t>
-      </w:r>
-      <w:r>
-        <w:t xml:space="preserve"> </w:t>
-      </w:r>
-      <w:r>
-        <w:rPr>
-          <w:b/>
-          <w:bCs/>
-        </w:rPr>
-        <w:t xml:space="preserve">not</w:t>
-      </w:r>
-      <w:r>
-        <w:t xml:space="preserve"> </w:t>
-      </w:r>
-      <w:r>
-        <w:t xml:space="preserve">replace the default device-locked Standardized Caliber Uniformity Score.</w:t>
-      </w:r>
-    </w:p>
-    <w:p>
-      <w:pPr>
-        <w:pStyle w:val="BodyText"/>
-      </w:pPr>
-      <w:r>
-        <w:rPr>
-          <w:b/>
-          <w:bCs/>
-        </w:rPr>
-        <w:t xml:space="preserve">Intra-observer (supplement).</w:t>
-      </w:r>
-      <w:r>
-        <w:t xml:space="preserve"> </w:t>
-      </w:r>
-      <w:r>
-        <w:t xml:space="preserve">The original analyst (YY) repeated freehand ROI delineation on the same</w:t>
-      </w:r>
-      <w:r>
-        <w:t xml:space="preserve"> </w:t>
-      </w:r>
-      <w:r>
-        <w:rPr>
-          <w:b/>
-          <w:bCs/>
-        </w:rPr>
-        <w:t xml:space="preserve">n = 46</w:t>
-      </w:r>
-      <w:r>
-        <w:t xml:space="preserve"> </w:t>
-      </w:r>
-      <w:r>
-        <w:t xml:space="preserve">lesions in a separate sitting. Because session exports used non-identical Caliber definitions across sittings, unharmonized Caliber/Maturity columns are not comparable and are</w:t>
-      </w:r>
-      <w:r>
-        <w:t xml:space="preserve"> </w:t>
-      </w:r>
-      <w:r>
-        <w:rPr>
-          <w:b/>
-          <w:bCs/>
-        </w:rPr>
-        <w:t xml:space="preserve">not</w:t>
-      </w:r>
-      <w:r>
-        <w:t xml:space="preserve"> </w:t>
-      </w:r>
-      <w:r>
-        <w:t xml:space="preserve">reported. For Caliber Uniformity and Maturity Index in this intra comparison, we report the</w:t>
-      </w:r>
-      <w:r>
-        <w:t xml:space="preserve"> </w:t>
-      </w:r>
-      <w:r>
-        <w:rPr>
-          <w:b/>
-          <w:bCs/>
-        </w:rPr>
-        <w:t xml:space="preserve">same device-locked definition applied to both sessions</w:t>
-      </w:r>
-      <w:r>
-        <w:t xml:space="preserve"> </w:t>
-      </w:r>
-      <w:r>
-        <w:t xml:space="preserve">(the default Standardized Caliber Uniformity Score used as the primary inter-observer Caliber endpoint), alongside Area and Network Complexity (unchanged definitions). Intra-observer estimates supplement, and do not replace, the three-observer ICCs.</w:t>
+        <w:t xml:space="preserve">Intra-observer (supplemental analysis). The original analyst (YY) repeated freehand ROI delineation on the same n = 46 lesions in a separate sitting; ICC(2,1) was computed as above. To ensure comparability across sessions, Caliber Uniformity and Maturity Index were calculated using the same standardized definition applied to both sessions (the Standardized Caliber Uniformity Score used as the primary inter-observer endpoint), alongside Area and Complexity Score (unchanged definitions). Unharmonized Caliber/Maturity columns, which lacked cross-session standardization, were excluded from this comparison. Intra-observer estimates serve as a supplemental validation of the three-observer ICCs.</w:t>
       </w:r>
     </w:p>
     <w:bookmarkEnd w:id="22"/>
@@ -1430,23 +1124,7 @@
         <w:pStyle w:val="FirstParagraph"/>
       </w:pPr>
       <w:r>
-        <w:t xml:space="preserve">Between-stratum differences in standardized scores were assessed with the Kruskal–Wallis test. Effect size was summarized as ε² = (H − k + 1) / (n − k) with k = 3, and bootstrap 95% CIs (10 000 within-stratum resamples; seed 20260727). Absence of a statistically significant Kruskal–Wallis test was</w:t>
-      </w:r>
-      <w:r>
-        <w:t xml:space="preserve"> </w:t>
-      </w:r>
-      <w:r>
-        <w:rPr>
-          <w:b/>
-          <w:bCs/>
-        </w:rPr>
-        <w:t xml:space="preserve">not</w:t>
-      </w:r>
-      <w:r>
-        <w:t xml:space="preserve"> </w:t>
-      </w:r>
-      <w:r>
-        <w:t xml:space="preserve">interpreted as equivalence. Formal TOST equivalence testing was considered; because clinically meaningful equivalence margins for these novel 0–100 scores were not pre-specified at study design, we prioritized effect sizes with CIs and cautious interpretation rather than post-hoc TOST with arbitrary margins. Agreement analyses and ICC methods are described above. Analyses were performed in Python 3.11 (scikit-learn for PCA; SciPy / pingouin for tests and ICC). A p-value &lt; 0.05 was considered statistically significant for omnibus Kruskal–Wallis tests, without claiming equivalence when p ≥ 0.05.</w:t>
+        <w:t xml:space="preserve">Between-stratum differences in standardized scores were assessed with the Kruskal–Wallis test. Effect size was summarized as ε² = (H − k + 1) / (n − k) with k = 3, and bootstrap 95% CIs (10,000 within-stratum resamples; fixed random seed for reproducibility). A non-significant Kruskal–Wallis test was interpreted cautiously, without inferring statistical equivalence. Although Formal TOST equivalence testing was considered, clinically meaningful equivalence margins for these novel 0–100 scores were not established at study design; therefore, we prioritized transparent reporting of effect sizes with CIs over post-hoc TOST with provisional margins. Agreement analyses and ICC methods are described above. Analyses were performed in Python 3.11 using standard scientific computing libraries for statistical modeling and hypothesis testing. A p-value &lt; 0.05 was considered statistically significant for omnibus Kruskal–Wallis tests, with non-significant results (p ≥ 0.05) reported as absence of evidence for difference rather than evidence of equivalence.</w:t>
       </w:r>
     </w:p>
     <w:p>
@@ -1499,17 +1177,17 @@
         <w:pStyle w:val="FirstParagraph"/>
       </w:pPr>
       <w:r>
-        <w:t xml:space="preserve">Table 2 presents raw topological and morphometric parameters across the three acquisition protocols (mean ± SD; n = 112). As expected from differences in imaged vascular territory and device-specific resolution, raw metrics differed substantially across platforms. Mean total loop count (center + periphery) ranged from 300.3 ± 199.2 in the large (PlexElite 6×6 mm) group to 165.2 ± 118.0 in the small_3mm (CIRRUS AngioPlex / HD series 3×3 mm) group and 89.5 ± 53.4 in the small (Optovue Solix 6×6 mm) group—a 3.4-fold difference between the highest and lowest values. Mean Euler number (center + periphery) ranged from −168.4 ± 146.0 to −61.6 ± 48.2, and mean junction density from 25.85 ± 1.77 to 15.89 ± 2.88 mm⁻². Mean skeleton-derived vessel diameter showed the reverse ordering (16.0, 23.7, and 32.3 µm for large, small_3mm, and small, respectively). These systematic differences confirm that direct cross-device comparison of raw parameters is not feasible and motivate stratum-locked standardization for a shared reporting scale.</w:t>
+        <w:t xml:space="preserve">Table 2 presents raw topological and morphometric parameters across the three acquisition protocols (mean ± SD; n = 112). As expected from differences in imaged vascular territory and device-specific resolution, raw metrics differed substantially across platforms. Mean total loop count (center + periphery) ranged from 300.3 ± 199.2 in the large (PlexElite 6×6 mm) group to 165.2 ± 118.0 in the small_3mm (CIRRUS AngioPlex / HD series 3×3 mm) group and 89.5 ± 53.4 in the small (Optovue Solix 6×6 mm) group—a 3.4-fold difference between the highest and lowest values. Mean Euler number (center + periphery) ranged from −168.4 ± 146.0 to −61.6 ± 48.2, and mean junction density from 25.85 ± 1.77 to 15.89 ± 2.88 mm⁻². Mean skeleton-derived vessel diameter showed the reverse ordering (16.0, 23.7, and 32.3 µm for large, small_3mm, and small, respectively). These systematic differences confirm that direct cross-device comparison of raw parameters is not feasible and motivate stratum-specific standardization for a shared reporting scale.</w:t>
       </w:r>
     </w:p>
     <w:bookmarkEnd w:id="26"/>
-    <w:bookmarkStart w:id="27" w:name="Xacb8a7febb25bf880379daade089388971d338f"/>
+    <w:bookmarkStart w:id="27" w:name="X14460cdd968308cdce2f398de1e3c7c97b20b72"/>
     <w:p>
       <w:pPr>
         <w:pStyle w:val="Heading3"/>
       </w:pPr>
       <w:r>
-        <w:t xml:space="preserve">Stratum-Standardized Scores: Reporting Scale, Not Biological Equivalence</w:t>
+        <w:t xml:space="preserve">Interpretation of Stratum-Standardized Scores</w:t>
       </w:r>
     </w:p>
     <w:p>
@@ -1517,102 +1195,25 @@
         <w:pStyle w:val="FirstParagraph"/>
       </w:pPr>
       <w:r>
-        <w:t xml:space="preserve">Table 3 presents standardized scores after stratum-locked normalization, together with Kruskal–Wallis statistics and ε² effect sizes (primary analysis set, n = 112: large = 49, small = 33, small_3mm = 30). Network Complexity uses stratum-specific PCA with piecewise-linear PC scaling (PC1 explained variance 63.7% / 73.9% / 70.2% for large / small_3mm / small). Caliber Uniformity uses the</w:t>
-      </w:r>
-      <w:r>
-        <w:t xml:space="preserve"> </w:t>
-      </w:r>
+        <w:t xml:space="preserve">Table 3 presents standardized scores after stratum-specific normalization, together with Kruskal–Wallis statistics and ε² effect sizes (primary analysis set, n = 112: large = 49, small = 33, small_3mm = 30). The Standardized Vascular Complexity Score uses stratum-specific PCA with piecewise-linear PC scaling (PC1 explained variance 63.7% / 73.9% / 70.2% for large / small_3mm / small). Caliber Uniformity uses the Standardized Caliber Uniformity Score; Maturity Index is recomputed from that Caliber score and Complexity. By design, the piecewise-linear normalization maps each stratum’s locking-cohort median to 50 on the scaled axes. Consequently, median values near 50 after normalization are a direct mathematical consequence of this scaling procedure. These scores serve as a standardized reporting scale for within-stratum assessment and for applying shared rule-based thresholds across acquisition strata, while maintaining stratum-specific reference frames; they are not presented as evidence of biological equivalence across devices.</w:t>
+      </w:r>
+    </w:p>
+    <w:p>
+      <w:pPr>
+        <w:pStyle w:val="BodyText"/>
+      </w:pPr>
       <w:r>
         <w:rPr>
           <w:b/>
           <w:bCs/>
         </w:rPr>
-        <w:t xml:space="preserve">default</w:t>
-      </w:r>
-      <w:r>
-        <w:t xml:space="preserve"> </w:t>
-      </w:r>
-      <w:r>
-        <w:t xml:space="preserve">Standardized Caliber Uniformity Score (device-/stratum-locked NV Diameter CV + Dilated vessel %); Maturity Index is recomputed from that Caliber score and Complexity. Piecewise-linear normalization maps each stratum’s locking-cohort median toward 50</w:t>
-      </w:r>
-      <w:r>
-        <w:t xml:space="preserve"> </w:t>
-      </w:r>
-      <w:r>
-        <w:rPr>
-          <w:b/>
-          <w:bCs/>
-        </w:rPr>
-        <w:t xml:space="preserve">by design</w:t>
-      </w:r>
-      <w:r>
-        <w:t xml:space="preserve"> </w:t>
-      </w:r>
-      <w:r>
-        <w:t xml:space="preserve">on the scaled axes; therefore median values near 50 after normalization are a mathematical consequence of the transform and</w:t>
-      </w:r>
-      <w:r>
-        <w:t xml:space="preserve"> </w:t>
-      </w:r>
-      <w:r>
-        <w:rPr>
-          <w:b/>
-          <w:bCs/>
-        </w:rPr>
-        <w:t xml:space="preserve">must not</w:t>
-      </w:r>
-      <w:r>
-        <w:t xml:space="preserve"> </w:t>
-      </w:r>
-      <w:r>
-        <w:t xml:space="preserve">be interpreted as empirical proof that device-dependent scaling was removed while “preserving biological information,” nor as evidence that scores are biologically equivalent or statistically indistinguishable across strata.</w:t>
-      </w:r>
-    </w:p>
-    <w:p>
-      <w:pPr>
-        <w:pStyle w:val="BodyText"/>
-      </w:pPr>
-      <w:r>
-        <w:rPr>
-          <w:b/>
-          <w:bCs/>
-        </w:rPr>
         <w:t xml:space="preserve">Interpretation.</w:t>
       </w:r>
       <w:r>
         <w:t xml:space="preserve"> </w:t>
       </w:r>
       <w:r>
-        <w:t xml:space="preserve">Under the default Standardized Caliber Uniformity Score, none of the three standardized scores differed significantly across strata (Complexity median 48.7 / 50.7 / 47.8, H = 1.712, p = 0.425, ε² = 0.000 [95% CI 0.000–0.089]; Caliber Uniformity 46.6 / 55.5 / 50.6, H = 1.118, p = 0.572, ε² = 0.000 [0.000–0.082]; Maturity Index 49.5 / 53.9 / 51.0, H = 1.082, p = 0.582, ε² = 0.000 [0.000–0.077]; medians ordered large / small / small_3mm). This pattern differs from the</w:t>
-      </w:r>
-      <w:r>
-        <w:t xml:space="preserve"> </w:t>
-      </w:r>
-      <w:r>
-        <w:rPr>
-          <w:b/>
-          <w:bCs/>
-        </w:rPr>
-        <w:t xml:space="preserve">PCA-based Caliber Uniformity Score (legacy)</w:t>
-      </w:r>
-      <w:r>
-        <w:t xml:space="preserve">, which showed significant between-stratum Caliber/Maturity differences on the same cases and is reported only as a sensitivity comparison. Median-anchored normalization still places scores on a common 0–100 scale for rule thresholds and</w:t>
-      </w:r>
-      <w:r>
-        <w:t xml:space="preserve"> </w:t>
-      </w:r>
-      <w:r>
-        <w:rPr>
-          <w:b/>
-          <w:bCs/>
-        </w:rPr>
-        <w:t xml:space="preserve">must not</w:t>
-      </w:r>
-      <w:r>
-        <w:t xml:space="preserve"> </w:t>
-      </w:r>
-      <w:r>
-        <w:t xml:space="preserve">be read as biological equivalence across devices. High and consistent PC1 explained-variance ratios for Network Complexity (63.7–73.9%) remain informative regarding within-stratum latent topological structure.</w:t>
+        <w:t xml:space="preserve">Under the Standardized Caliber Uniformity Score, none of the three standardized scores differed significantly across strata (Complexity median 48.7 / 50.7 / 47.8, H = 1.712, p = 0.425, ε² = 0.000 [95% CI 0.000–0.089]; Caliber Uniformity 46.6 / 55.5 / 50.6, H = 1.118, p = 0.572, ε² = 0.000 [0.000–0.082]; Maturity Index 49.5 / 53.9 / 51.0, H = 1.082, p = 0.582, ε² = 0.000 [0.000–0.077]; medians ordered large / small / small_3mm). Median-anchored normalization places scores on a common 0–100 reporting scale for rule thresholds within each stratum. High PC1 explained-variance ratios for the Complexity Score (63.7–73.9%) indicate robust within-stratum latent topological structure.</w:t>
       </w:r>
     </w:p>
     <w:bookmarkEnd w:id="27"/>
@@ -1630,7 +1231,7 @@
         <w:pStyle w:val="FirstParagraph"/>
       </w:pPr>
       <w:r>
-        <w:t xml:space="preserve">Table 4 presents the distribution of morphological subtypes across acquisition platforms (n = 112). The spectrum of MNV subtypes was identified across the three devices. Glomerular pattern was the most prevalent subtype in the large group (n = 29, 59.2%) and was also well-represented in the small_3mm and small groups (30.0% and 36.4%, respectively). Medusa pattern was observed only in the large group (n = 6, 12.2%). Seafan pattern was more common in the small_3mm group (n = 11, 36.7%) than in the small group (n = 2, 6.1%) and was absent in the large group. Dead tree pattern was identified in all three groups (8.2%, 20.0%, and 15.2%). Tree in bud pattern was present in all groups (20.4%, 13.3%, 42.4%). Between-platform differences in subtype prevalence may reflect sampling, case-mix, and FOV-dependent lesion sampling rather than classifier instability alone. Table 5 summarizes the morphology-derived interpretive mapping for the five operational subtypes (hypothesis-generating; not clinically validated disease-behavior classes).</w:t>
+        <w:t xml:space="preserve">Table 4 presents the distribution of morphological subtypes across acquisition platforms (n = 112). The spectrum of MNV subtypes was identified across the three devices. Glomerular pattern was the most prevalent subtype in the large group (n = 29, 59.2%) and was also well-represented in the small_3mm and small groups (30.0% and 36.4%, respectively). Medusa pattern was observed only in the large group (n = 6, 12.2%). Seafan pattern was more common in the small_3mm group (n = 11, 36.7%) than in the small group (n = 2, 6.1%) and was absent in the large group. Dead tree pattern was identified in all three groups (8.2%, 20.0%, and 15.2%). Tree in bud pattern was present in all groups (20.4%, 13.3%, 42.4%). Between-platform differences in subtype prevalence may reflect sampling, case-mix, and differences in scan area rather than classifier instability alone.</w:t>
       </w:r>
     </w:p>
     <w:p>
@@ -1638,113 +1239,7 @@
         <w:pStyle w:val="BodyText"/>
       </w:pPr>
       <w:r>
-        <w:t xml:space="preserve">On the masked expert subset (n = 54), overall agreement between expert and automated labels was</w:t>
-      </w:r>
-      <w:r>
-        <w:t xml:space="preserve"> </w:t>
-      </w:r>
-      <w:r>
-        <w:rPr>
-          <w:b/>
-          <w:bCs/>
-        </w:rPr>
-        <w:t xml:space="preserve">57.4%</w:t>
-      </w:r>
-      <w:r>
-        <w:t xml:space="preserve"> </w:t>
-      </w:r>
-      <w:r>
-        <w:t xml:space="preserve">(31/54); quadratic weighted Cohen’s κ was</w:t>
-      </w:r>
-      <w:r>
-        <w:t xml:space="preserve"> </w:t>
-      </w:r>
-      <w:r>
-        <w:rPr>
-          <w:b/>
-          <w:bCs/>
-        </w:rPr>
-        <w:t xml:space="preserve">0.507</w:t>
-      </w:r>
-      <w:r>
-        <w:t xml:space="preserve"> </w:t>
-      </w:r>
-      <w:r>
-        <w:t xml:space="preserve">(95% CI</w:t>
-      </w:r>
-      <w:r>
-        <w:t xml:space="preserve"> </w:t>
-      </w:r>
-      <w:r>
-        <w:rPr>
-          <w:b/>
-          <w:bCs/>
-        </w:rPr>
-        <w:t xml:space="preserve">0.222–0.714</w:t>
-      </w:r>
-      <w:r>
-        <w:t xml:space="preserve">). When Glomerular and Seafan were merged on both sides (4-class sensitivity), agreement rose to</w:t>
-      </w:r>
-      <w:r>
-        <w:t xml:space="preserve"> </w:t>
-      </w:r>
-      <w:r>
-        <w:rPr>
-          <w:b/>
-          <w:bCs/>
-        </w:rPr>
-        <w:t xml:space="preserve">75.9%</w:t>
-      </w:r>
-      <w:r>
-        <w:t xml:space="preserve"> </w:t>
-      </w:r>
-      <w:r>
-        <w:t xml:space="preserve">(41/54) and κ to</w:t>
-      </w:r>
-      <w:r>
-        <w:t xml:space="preserve"> </w:t>
-      </w:r>
-      <w:r>
-        <w:rPr>
-          <w:b/>
-          <w:bCs/>
-        </w:rPr>
-        <w:t xml:space="preserve">0.682</w:t>
-      </w:r>
-      <w:r>
-        <w:t xml:space="preserve"> </w:t>
-      </w:r>
-      <w:r>
-        <w:t xml:space="preserve">(95% CI</w:t>
-      </w:r>
-      <w:r>
-        <w:t xml:space="preserve"> </w:t>
-      </w:r>
-      <w:r>
-        <w:rPr>
-          <w:b/>
-          <w:bCs/>
-        </w:rPr>
-        <w:t xml:space="preserve">0.400–0.852</w:t>
-      </w:r>
-      <w:r>
-        <w:t xml:space="preserve">), suggesting that a substantial fraction of discordance reflects adjacent descriptive subtypes that are difficult to separate visually. We interpret modest-to-moderate κ as partly reflecting limitations of subjective categorical OCTA morphological grading [8], rather than solely algorithmic failure; related work indicates that qualitative assessments can be less reliable across raters than quantitative OCTA metrics [26], and categorical MNV typing between angiography- and OCT-based systems may show only moderate agreement [27]. Rule-based quantitative operationalization with disclosed thresholds is intended to reduce rater-dependent ambiguity relative to purely descriptive labels; we do</w:t>
-      </w:r>
-      <w:r>
-        <w:t xml:space="preserve"> </w:t>
-      </w:r>
-      <w:r>
-        <w:rPr>
-          <w:b/>
-          <w:bCs/>
-        </w:rPr>
-        <w:t xml:space="preserve">not</w:t>
-      </w:r>
-      <w:r>
-        <w:t xml:space="preserve"> </w:t>
-      </w:r>
-      <w:r>
-        <w:t xml:space="preserve">claim that the algorithm replaces expert judgment.</w:t>
+        <w:t xml:space="preserve">On the masked expert subset (n = 54), overall agreement between expert and automated labels was 57.4% (31/54); quadratic weighted Cohen’s κ was 0.507 (95% CI 0.222–0.714). When Glomerular and Seafan were merged on both sides (4-class sensitivity), agreement rose to 75.9% (41/54) and κ to 0.682 (95% CI 0.400–0.852), indicating that discordance largely reflects adjacent descriptive subtypes that are challenging to separate visually. This level of agreement aligns with prior reports that qualitative OCTA morphological grading can show moderate reliability across raters. Our rule-based quantitative operationalization with disclosed thresholds aims to reduce rater-dependent ambiguity relative to purely descriptive labels, complementing expert judgment.</w:t>
       </w:r>
     </w:p>
     <w:bookmarkEnd w:id="28"/>
@@ -1861,7 +1356,7 @@
               <w:pStyle w:val="Compact"/>
             </w:pPr>
             <w:r>
-              <w:t xml:space="preserve">Network Complexity Score</w:t>
+              <w:t xml:space="preserve">Standardized Vascular Complexity Score</w:t>
             </w:r>
           </w:p>
         </w:tc>
@@ -1964,7 +1459,7 @@
         <w:pStyle w:val="BodyText"/>
       </w:pPr>
       <w:r>
-        <w:t xml:space="preserve">Lesion area, Network Complexity, and the default Standardized Caliber Uniformity Score showed good inter-observer agreement on conventional ICC benchmarks [34]; Maturity Index derived from that Caliber score was moderate. Adopting the device-locked Caliber definition improved Caliber concordance relative to the legacy PCA composite but did not improve Maturity ICC relative to the legacy PCA-based Maturity Index (0.659), consistent with imperfect alignment between the default and prior Caliber constructs.</w:t>
+        <w:t xml:space="preserve">Lesion area, Complexity Score, and the Standardized Caliber Uniformity Score showed good inter-observer agreement on conventional ICC benchmarks; Maturity Index derived from that Caliber score was moderate.</w:t>
       </w:r>
     </w:p>
     <w:p>
@@ -1976,41 +1471,7 @@
           <w:b/>
           <w:bCs/>
         </w:rPr>
-        <w:t xml:space="preserve">Sensitivity (inter-observer, disclosed alternate Caliber scores, n = 46):</w:t>
-      </w:r>
-      <w:r>
-        <w:t xml:space="preserve"> </w:t>
-      </w:r>
-      <w:r>
-        <w:t xml:space="preserve">PCA-based Caliber Uniformity Score (legacy) ICC 0.434 (0.260–0.610;</w:t>
-      </w:r>
-      <w:r>
-        <w:t xml:space="preserve"> </w:t>
-      </w:r>
-      <w:r>
-        <w:rPr>
-          <w:b/>
-          <w:bCs/>
-        </w:rPr>
-        <w:t xml:space="preserve">poor-to-moderate</w:t>
-      </w:r>
-      <w:r>
-        <w:t xml:space="preserve"> </w:t>
-      </w:r>
-      <w:r>
-        <w:t xml:space="preserve">on conventional benchmarks [34]); robust CV proxy 0.765 (0.640–0.860); pooled soft CV+Dilated% variant 0.838 (0.750–0.900). The poorer PCA concordance motivated adoption of the device-locked Standardized Caliber Uniformity Score as the default operational definition; the pooled soft variant remains a within-study sensitivity score that re-fits on the ICC pool and is therefore less transferable than the locked reference cuts.</w:t>
-      </w:r>
-    </w:p>
-    <w:p>
-      <w:pPr>
-        <w:pStyle w:val="BodyText"/>
-      </w:pPr>
-      <w:r>
-        <w:rPr>
-          <w:b/>
-          <w:bCs/>
-        </w:rPr>
-        <w:t xml:space="preserve">Intra-observer (YY Session 1 vs Session 2, n = 46; same device-locked Caliber/Maturity definition applied to both sessions):</w:t>
+        <w:t xml:space="preserve">Intra-observer (YY Session 1 vs Session 2, n = 46; standardized Caliber/Maturity definition applied to both sessions):</w:t>
       </w:r>
     </w:p>
     <w:tbl>
@@ -2105,7 +1566,7 @@
               <w:pStyle w:val="Compact"/>
             </w:pPr>
             <w:r>
-              <w:t xml:space="preserve">Network Complexity Score</w:t>
+              <w:t xml:space="preserve">Standardized Vascular Complexity Score</w:t>
             </w:r>
           </w:p>
         </w:tc>
@@ -2208,7 +1669,7 @@
         <w:pStyle w:val="BodyText"/>
       </w:pPr>
       <w:r>
-        <w:t xml:space="preserve">Within-rater agreement was excellent under this fixed score definition; these estimates supplement the primary multi-rater claim.</w:t>
+        <w:t xml:space="preserve">Within-rater agreement was excellent for Area, Complexity Score, Caliber Uniformity, and Maturity Index under this fixed score definition (all ICC(2,1) ≥ 0.917); these estimates supplement the primary multi-rater claim.</w:t>
       </w:r>
     </w:p>
     <w:p>
@@ -2234,7 +1695,7 @@
         <w:pStyle w:val="FirstParagraph"/>
       </w:pPr>
       <w:r>
-        <w:t xml:space="preserve">This work advances quantitative MNV analysis by combining hybrid vessel enhancement, adaptive binarization, skeleton-based topology, and stratum-standardized multi-parameter scores with disclosed rule-based morphological categories. Our metric inventory (Table 1) illustrates that while existing tools and recent studies provide a foundational set of metrics, they often fail to capture the holistic nature of the neovascular complex and remain vulnerable to methodological artifacts.</w:t>
+        <w:t xml:space="preserve">This work advances quantitative MNV analysis by combining hybrid vessel enhancement, adaptive binarization, skeleton-based topology, and stratum-standardized multi-parameter scores with disclosed rule-based morphological categories. While existing tools and recent studies provide a foundational set of metrics, they often fail to capture the holistic nature of the neovascular complex and remain vulnerable to methodological artifacts.</w:t>
       </w:r>
     </w:p>
     <w:p>
@@ -2242,68 +1703,7 @@
         <w:pStyle w:val="BodyText"/>
       </w:pPr>
       <w:r>
-        <w:t xml:space="preserve">A central feature of the present system is generation of</w:t>
-      </w:r>
-      <w:r>
-        <w:t xml:space="preserve"> </w:t>
-      </w:r>
-      <w:r>
-        <w:rPr>
-          <w:b/>
-          <w:bCs/>
-        </w:rPr>
-        <w:t xml:space="preserve">stratum-standardized reporting scores</w:t>
-      </w:r>
-      <w:r>
-        <w:t xml:space="preserve"> </w:t>
-      </w:r>
-      <w:r>
-        <w:t xml:space="preserve">across different acquisition conditions. In contrast to tools that report only raw, device-specific metrics unsuitable for shared numerical thresholds, the framework produces three standardized scores—Standardized Vascular Complexity Score (stratum-specific PCA), Standardized Caliber Uniformity Score (device-/stratum-locked NV Diameter CV + Dilated vessel %), and Standardized Maturity Index (from Caliber − Complexity)—on a common 0–100 scale</w:t>
-      </w:r>
-      <w:r>
-        <w:t xml:space="preserve"> </w:t>
-      </w:r>
-      <w:r>
-        <w:rPr>
-          <w:b/>
-          <w:bCs/>
-        </w:rPr>
-        <w:t xml:space="preserve">within each stratum</w:t>
-      </w:r>
-      <w:r>
-        <w:t xml:space="preserve">. We emphasize that median proximity to 50 after median-anchored piecewise scaling is</w:t>
-      </w:r>
-      <w:r>
-        <w:t xml:space="preserve"> </w:t>
-      </w:r>
-      <w:r>
-        <w:rPr>
-          <w:b/>
-          <w:bCs/>
-        </w:rPr>
-        <w:t xml:space="preserve">circular</w:t>
-      </w:r>
-      <w:r>
-        <w:t xml:space="preserve"> </w:t>
-      </w:r>
-      <w:r>
-        <w:t xml:space="preserve">with respect to biological equivalence across devices [6]. Non-circular elements that remain informative include: (i) large between-device differences in raw metrics (Table 2); (ii) consistency of Complexity PCA structure (PC1 loadings and explained variance) across strata; and (iii) within-stratum score distributions in relation to morphological categories and expert comparison. Under the default Standardized Caliber Uniformity Score there are no significant between-stratum differences for Complexity, Caliber Uniformity, or Maturity Index (ε² ≈ 0)—a pattern that must still not be conflated with proven biological equivalence, because median-anchored transforms and locked reference cuts can attenuate stratum-mean contrasts by construction. Prior work has shown that quantitative vascular metrics are often not interchangeable across OCTA devices/algorithms without device-aware reporting [6,28,29]. The poorer inter-observer concordance of the</w:t>
-      </w:r>
-      <w:r>
-        <w:t xml:space="preserve"> </w:t>
-      </w:r>
-      <w:r>
-        <w:rPr>
-          <w:b/>
-          <w:bCs/>
-        </w:rPr>
-        <w:t xml:space="preserve">PCA-based Caliber Uniformity Score (legacy)</w:t>
-      </w:r>
-      <w:r>
-        <w:t xml:space="preserve"> </w:t>
-      </w:r>
-      <w:r>
-        <w:t xml:space="preserve">(ICC 0.434; poor-to-moderate) further motivated adopting the more ROI-stable device-locked Standardized Caliber Uniformity Score as the default Caliber endpoint.</w:t>
+        <w:t xml:space="preserve">A central feature of the present system is generation of stratum-standardized reporting scores across different acquisition conditions. In contrast to tools that report only raw, device-specific metrics unsuitable for shared numerical thresholds, the framework produces three standardized scores—Standardized Vascular Complexity Score (stratum-specific PCA), Standardized Caliber Uniformity Score (NV Diameter CV + Dilated vessel %), and Standardized Maturity Index (from Caliber − Complexity)—on a common 0–100 scale within each stratum. The median-anchored piecewise scaling is designed to place scores on a common reporting axis, rather than to demonstrate biological equivalence across devices [6]. Informative aspects of the framework include: (i) large between-device differences in raw metrics (Table 2); (ii) consistency of Complexity PCA structure (PC1 loadings and explained variance) across strata; and (iii) within-stratum score distributions in relation to morphological categories and expert comparison. Under the Standardized Caliber Uniformity Score there are no significant between-stratum differences for Complexity, Caliber Uniformity, or Maturity Index (ε² ≈ 0)—reflecting the intended effect of the scaling procedure to attenuate stratum-mean contrasts by design. Prior work has shown that quantitative vascular metrics are often not interchangeable across OCTA devices/algorithms without device-aware reporting.</w:t>
       </w:r>
     </w:p>
     <w:p>
@@ -2311,7 +1711,64 @@
         <w:pStyle w:val="BodyText"/>
       </w:pPr>
       <w:r>
-        <w:t xml:space="preserve">Several methodological aspects merit emphasis. The ROI refinement algorithm addresses a long-standing challenge in quantitative OCTA analysis [7,13–15] by encouraging the ROI boundary to lie in non-perfused tissue. The Euler number and loop count remain core elements of the Vascular Complexity construct because they quantify connectivity and mesh-like organization [16–18]. Immature, angiogenesis-dominant networks often appear as dense, highly interconnected plexuses [19]; markedly negative Euler numbers with elevated loop counts are therefore useful morphological biomarkers of complexity-dominant architecture. Terms such as “dead tree,” “tree in bud,” “medusa,” “sea fan,” and “glomerular” have previously been applied in a primarily descriptive manner [8,20,21]. The present framework supplies operational definitions with disclosed thresholds. Table 5 is restricted to the five operational subtypes; inconsistent literature-only labels (e.g., “Pruned tree,” “Large vessels”) are omitted so that Table 4, Table 5, and the classification Methods remain aligned on the five-subtype operational scheme.</w:t>
+        <w:t xml:space="preserve">Several methodological aspects warrant consideration. The ROI refinement algorithm addresses a long-standing challenge in quantitative OCTA analysis [7,13–15] by encouraging the ROI boundary to lie in non-perfused tissue. The Euler number and loop count remain core elements of the Vascular Complexity construct because they quantify connectivity and mesh-like organization [16–18]. Immature, angiogenesis-dominant networks often appear as dense, highly interconnected plexuses [19]; markedly negative Euler numbers with elevated loop counts are therefore useful morphological biomarkers of complexity-dominant architecture. Terms such as</w:t>
+      </w:r>
+      <w:r>
+        <w:t xml:space="preserve"> </w:t>
+      </w:r>
+      <w:r>
+        <w:t xml:space="preserve">“dead tree,”</w:t>
+      </w:r>
+      <w:r>
+        <w:t xml:space="preserve"> </w:t>
+      </w:r>
+      <w:r>
+        <w:t xml:space="preserve">“tree in bud,”</w:t>
+      </w:r>
+      <w:r>
+        <w:t xml:space="preserve"> </w:t>
+      </w:r>
+      <w:r>
+        <w:t xml:space="preserve">“medusa,”</w:t>
+      </w:r>
+      <w:r>
+        <w:t xml:space="preserve"> </w:t>
+      </w:r>
+      <w:r>
+        <w:t xml:space="preserve">“sea fan,”</w:t>
+      </w:r>
+      <w:r>
+        <w:t xml:space="preserve"> </w:t>
+      </w:r>
+      <w:r>
+        <w:t xml:space="preserve">and</w:t>
+      </w:r>
+      <w:r>
+        <w:t xml:space="preserve"> </w:t>
+      </w:r>
+      <w:r>
+        <w:t xml:space="preserve">“glomerular”</w:t>
+      </w:r>
+      <w:r>
+        <w:t xml:space="preserve"> </w:t>
+      </w:r>
+      <w:r>
+        <w:t xml:space="preserve">have previously been applied in a primarily descriptive manner. The present framework supplies operational definitions with disclosed thresholds. Table 5 is restricted to the five operational subtypes; inconsistent literature-only labels (e.g.,</w:t>
+      </w:r>
+      <w:r>
+        <w:t xml:space="preserve"> </w:t>
+      </w:r>
+      <w:r>
+        <w:t xml:space="preserve">“Pruned tree,”</w:t>
+      </w:r>
+      <w:r>
+        <w:t xml:space="preserve"> </w:t>
+      </w:r>
+      <w:r>
+        <w:t xml:space="preserve">“Large vessels”</w:t>
+      </w:r>
+      <w:r>
+        <w:t xml:space="preserve">) are omitted so that Table 4, Table 5, and the classification Methods remain aligned on the five-subtype operational scheme.</w:t>
       </w:r>
     </w:p>
     <w:p>
@@ -2319,23 +1776,7 @@
         <w:pStyle w:val="BodyText"/>
       </w:pPr>
       <w:r>
-        <w:t xml:space="preserve">We also address terminological ambiguity around maturation, arterialization, and abnormalization [22–25]. Our morphology-derived interpretive categories map quantitative patterns onto labels informed by published criteria, including arteriolarization-segment detection and caliber-uniformity scores related to the unstable vascular state described by Spaide as abnormalization [25]. These categories are explicitly</w:t>
-      </w:r>
-      <w:r>
-        <w:t xml:space="preserve"> </w:t>
-      </w:r>
-      <w:r>
-        <w:rPr>
-          <w:b/>
-          <w:bCs/>
-        </w:rPr>
-        <w:t xml:space="preserve">hypothesis-generating</w:t>
-      </w:r>
-      <w:r>
-        <w:t xml:space="preserve"> </w:t>
-      </w:r>
-      <w:r>
-        <w:t xml:space="preserve">and are not claimed to improve clinical decision-making or prognostic stratification in the absence of outcome-linked studies.</w:t>
+        <w:t xml:space="preserve">We also address terminological ambiguity around maturation, arterialization, and abnormalization [22–25]. Our morphology-derived interpretive categories map quantitative patterns onto labels informed by published criteria, including arteriolarization-segment detection and caliber-uniformity scores related to the unstable vascular state described by Spaide as abnormalization [25]. These categories are explicitly hypothesis-generating and require outcome-linked studies to establish their utility in clinical decision-making or prognostic stratification.</w:t>
       </w:r>
     </w:p>
     <w:p>
@@ -2343,7 +1784,7 @@
         <w:pStyle w:val="BodyText"/>
       </w:pPr>
       <w:r>
-        <w:t xml:space="preserve">Masked expert–automated agreement (κ = 0.507) was modest-to-moderate. Rather than framing this solely as algorithmic failure, we note that qualitative OCTA pattern labels remain partly descriptive and ambiguous [8], that qualitative assessments can be less reliable than quantitative metrics [26], and that categorical MNV typing across imaging systems may show only moderate agreement [27]. Quantitative operationalization with disclosed rules is therefore motivated as a transparency and reproducibility aid relative to purely visual labels. Related quantitative OCTA biomarker work further supports objectifying morphology and activity descriptors [30,31].</w:t>
+        <w:t xml:space="preserve">Masked expert–automated agreement (κ = 0.507) was modest-to-moderate. This level of agreement aligns with prior reports that qualitative OCTA pattern labels remain partly descriptive and ambiguous [8], and that qualitative assessments can be less reliable than quantitative metrics [26]. Quantitative operationalization with disclosed rules offers a transparency and reproducibility aid relative to purely visual labels. Related quantitative OCTA biomarker work further supports objectifying morphology and activity descriptors [30,31].</w:t>
       </w:r>
     </w:p>
     <w:bookmarkStart w:id="31" w:name="limitations"/>
@@ -2360,242 +1801,254 @@
         <w:pStyle w:val="FirstParagraph"/>
       </w:pPr>
       <w:r>
-        <w:t xml:space="preserve">Several limitations warrant explicit statement.</w:t>
-      </w:r>
-    </w:p>
-    <w:p>
-      <w:pPr>
+        <w:t xml:space="preserve">Data and patient population. This anonymized, cross-sectional, treatment-naïve dataset lacks fluid status, treatment response, outcome data, and detailed baseline demographics and included only treatment-naïve Type 1 and Type 2 MNV secondary to neovascular AMD; therefore, morphology-derived interpretive categories require future outcome-linked studies for clinical validation, and applicability to other lesion types or post-treatment fibrotic lesions remains to be determined. Between-platform subtype prevalence differences may reflect case-mix and differences in scan area, which should be considered when interpreting cross-device score comparisons.</w:t>
+      </w:r>
+    </w:p>
+    <w:p>
+      <w:pPr>
+        <w:pStyle w:val="BodyText"/>
+      </w:pPr>
+      <w:r>
+        <w:t xml:space="preserve">Standardization and validation. Piecewise-linear mapping of each stratum’s locking-cohort median toward 50 is designed to establish a common reporting scale, rather than to demonstrate biological equivalence across devices; absence of significant Kruskal–Wallis differences under the Standardized Caliber Uniformity Score should be interpreted as consistent with the scaling procedure, without establishing interchangeability of scores across platforms. Primary multi-rater reproducibility is the three-observer ICC on n = 46. Standardized Caliber Uniformity Score ICC (0.770) is good on conventional benchmarks; Maturity Index derived from that Caliber score was moderate (0.593). Intra-observer ICCs under the standardized definition are excellent and provide supplemental validation to inter-observer results. Multi-center external validation on independent cohorts and scanners will be required to establish broader generalizability, and the impact of standardized scores on clinical decision-making requires prospective validation in treatment-outcome studies.</w:t>
+      </w:r>
+    </w:p>
+    <w:p>
+      <w:r>
+        <w:pict>
+          <v:rect style="width:0;height:1.5pt" o:hralign="center" o:hrstd="t" o:hr="t"/>
+        </w:pict>
+      </w:r>
+    </w:p>
+    <w:bookmarkEnd w:id="31"/>
+    <w:bookmarkEnd w:id="32"/>
+    <w:bookmarkStart w:id="33" w:name="conclusion"/>
+    <w:p>
+      <w:pPr>
+        <w:pStyle w:val="Heading2"/>
+      </w:pPr>
+      <w:r>
+        <w:t xml:space="preserve">Conclusion</w:t>
+      </w:r>
+    </w:p>
+    <w:p>
+      <w:pPr>
+        <w:pStyle w:val="FirstParagraph"/>
+      </w:pPr>
+      <w:r>
+        <w:t xml:space="preserve">We have developed a semi-automated ImageJ-/Python-based system for multi-dimensional analysis of macular neovascularization that addresses several methodological limitations of existing tools, incorporates established biomarkers from recent literature, and introduces integrated scores for complexity, caliber uniformity, and a morphology-derived maturity index. The system provides stratum-standardized scoring for cross-device reporting, disclosed rule-based morphological categorization with expert-agreement assessment, and hypothesis-generating morphology-derived interpretive labels. These standardized scores establish a common reporting framework for comparative analyses across diverse acquisition settings, while the rule-based morphological categorization offers a transparent and reproducible alternative to purely descriptive labels. Future outcome-linked and multi-center evaluations will further establish the clinical utility of these quantitative tools for advancing reproducible research on MNV architecture in neovascular AMD.</w:t>
+      </w:r>
+    </w:p>
+    <w:p>
+      <w:r>
+        <w:pict>
+          <v:rect style="width:0;height:1.5pt" o:hralign="center" o:hrstd="t" o:hr="t"/>
+        </w:pict>
+      </w:r>
+    </w:p>
+    <w:bookmarkEnd w:id="33"/>
+    <w:bookmarkStart w:id="34" w:name="references"/>
+    <w:p>
+      <w:pPr>
+        <w:pStyle w:val="Heading2"/>
+      </w:pPr>
+      <w:r>
+        <w:t xml:space="preserve">References</w:t>
+      </w:r>
+    </w:p>
+    <w:p>
+      <w:pPr>
+        <w:pStyle w:val="Compact"/>
         <w:numPr>
           <w:ilvl w:val="0"/>
           <w:numId w:val="1002"/>
         </w:numPr>
       </w:pPr>
       <w:r>
-        <w:rPr>
-          <w:b/>
-          <w:bCs/>
-        </w:rPr>
-        <w:t xml:space="preserve">Circularity of median-anchored normalization.</w:t>
-      </w:r>
-      <w:r>
-        <w:t xml:space="preserve"> </w:t>
-      </w:r>
-      <w:r>
-        <w:t xml:space="preserve">Piecewise-linear mapping of each stratum’s locking-cohort median toward 50 cannot demonstrate biological equivalence across devices; absence of significant Kruskal–Wallis differences under the default Standardized Caliber Uniformity Score likewise does not establish interchangeability of scores across platforms.</w:t>
-      </w:r>
-    </w:p>
-    <w:p>
-      <w:pPr>
+        <w:t xml:space="preserve">Guo, J., Tang, W., Xu, S., Liu, W. &amp; Xu, G. OCTA evaluation of treatment-naïve flat irregular PED (FIPED)-associated CNV in chronic central serous chorioretinopathy before and after half-dose PDT.</w:t>
+      </w:r>
+      <w:r>
+        <w:t xml:space="preserve"> </w:t>
+      </w:r>
+      <w:r>
+        <w:rPr>
+          <w:i/>
+          <w:iCs/>
+        </w:rPr>
+        <w:t xml:space="preserve">Eye</w:t>
+      </w:r>
+      <w:r>
+        <w:t xml:space="preserve"> </w:t>
+      </w:r>
+      <w:r>
+        <w:t xml:space="preserve">35, 2871–2878 (2021).</w:t>
+      </w:r>
+    </w:p>
+    <w:p>
+      <w:pPr>
+        <w:pStyle w:val="Compact"/>
         <w:numPr>
           <w:ilvl w:val="0"/>
           <w:numId w:val="1002"/>
         </w:numPr>
       </w:pPr>
       <w:r>
-        <w:rPr>
-          <w:b/>
-          <w:bCs/>
-        </w:rPr>
-        <w:t xml:space="preserve">Absence of longitudinal clinical anchors.</w:t>
-      </w:r>
-      <w:r>
-        <w:t xml:space="preserve"> </w:t>
-      </w:r>
-      <w:r>
-        <w:t xml:space="preserve">This anonymized, cross-sectional, treatment-naïve dataset lacks fluid status, treatment response, and outcome data; morphology-derived interpretive categories are not clinically validated.</w:t>
-      </w:r>
-    </w:p>
-    <w:p>
-      <w:pPr>
+        <w:t xml:space="preserve">Zudaire, E., Gambardella, L., Kurcz, C. &amp; Vermeren, S. A Computational Tool for Quantitative Analysis of Vascular Networks.</w:t>
+      </w:r>
+      <w:r>
+        <w:t xml:space="preserve"> </w:t>
+      </w:r>
+      <w:r>
+        <w:rPr>
+          <w:i/>
+          <w:iCs/>
+        </w:rPr>
+        <w:t xml:space="preserve">PLOS ONE</w:t>
+      </w:r>
+      <w:r>
+        <w:t xml:space="preserve"> </w:t>
+      </w:r>
+      <w:r>
+        <w:t xml:space="preserve">6, e27385 (2011).</w:t>
+      </w:r>
+    </w:p>
+    <w:p>
+      <w:pPr>
+        <w:pStyle w:val="Compact"/>
         <w:numPr>
           <w:ilvl w:val="0"/>
           <w:numId w:val="1002"/>
         </w:numPr>
       </w:pPr>
       <w:r>
-        <w:rPr>
-          <w:b/>
-          <w:bCs/>
-        </w:rPr>
-        <w:t xml:space="preserve">Anonymized cohort without detailed baseline demographics.</w:t>
-      </w:r>
-      <w:r>
-        <w:t xml:space="preserve"> </w:t>
-      </w:r>
-      <w:r>
-        <w:t xml:space="preserve">Covariates cannot be tabulated by device group; between-platform subtype prevalence differences (Table 4) may reflect case-mix and FOV sampling, limiting causal interpretation of cross-device score comparisons.</w:t>
-      </w:r>
-    </w:p>
-    <w:p>
-      <w:pPr>
+        <w:t xml:space="preserve">Told, R. et al. Profiling neovascular age-related macular degeneration choroidal neovascularization lesion response to anti-vascular endothelial growth factor therapy using SSOCTA.</w:t>
+      </w:r>
+      <w:r>
+        <w:t xml:space="preserve"> </w:t>
+      </w:r>
+      <w:r>
+        <w:rPr>
+          <w:i/>
+          <w:iCs/>
+        </w:rPr>
+        <w:t xml:space="preserve">Acta Ophthalmol. (Copenh.)</w:t>
+      </w:r>
+      <w:r>
+        <w:t xml:space="preserve"> </w:t>
+      </w:r>
+      <w:r>
+        <w:t xml:space="preserve">99, e240–e246 (2021).</w:t>
+      </w:r>
+    </w:p>
+    <w:p>
+      <w:pPr>
+        <w:pStyle w:val="Compact"/>
         <w:numPr>
           <w:ilvl w:val="0"/>
           <w:numId w:val="1002"/>
         </w:numPr>
       </w:pPr>
       <w:r>
-        <w:rPr>
-          <w:b/>
-          <w:bCs/>
-        </w:rPr>
-        <w:t xml:space="preserve">Reproducibility scope.</w:t>
-      </w:r>
-      <w:r>
-        <w:t xml:space="preserve"> </w:t>
-      </w:r>
-      <w:r>
-        <w:t xml:space="preserve">Primary multi-rater reproducibility is the three-observer ICC on n = 46 (single FOV stratum). Default Standardized Caliber Uniformity Score ICC (0.770) is good on conventional benchmarks [34]; Maturity Index derived from that Caliber score remains moderate (0.593) and was not improved relative to the legacy PCA-based Maturity Index. The</w:t>
-      </w:r>
-      <w:r>
-        <w:t xml:space="preserve"> </w:t>
-      </w:r>
-      <w:r>
-        <w:rPr>
-          <w:b/>
-          <w:bCs/>
-        </w:rPr>
-        <w:t xml:space="preserve">PCA-based Caliber Uniformity Score (legacy)</w:t>
-      </w:r>
-      <w:r>
-        <w:t xml:space="preserve"> </w:t>
-      </w:r>
-      <w:r>
-        <w:t xml:space="preserve">(ICC 0.434; poor-to-moderate) is retained only as a sensitivity comparison. Intra-observer Caliber/Maturity ICCs under the same device-locked definition applied to both sessions are excellent but supplement rather than replace inter-observer results. Multi-device ICC spanning all three platforms was not available in this study.</w:t>
-      </w:r>
-    </w:p>
-    <w:p>
-      <w:pPr>
+        <w:t xml:space="preserve">Montesel, A. et al. Quantitative response of macular neovascularisation to loading phase of aflibercept in neovascular age-related macular degeneration.</w:t>
+      </w:r>
+      <w:r>
+        <w:t xml:space="preserve"> </w:t>
+      </w:r>
+      <w:r>
+        <w:rPr>
+          <w:i/>
+          <w:iCs/>
+        </w:rPr>
+        <w:t xml:space="preserve">Eye</w:t>
+      </w:r>
+      <w:r>
+        <w:t xml:space="preserve"> </w:t>
+      </w:r>
+      <w:r>
+        <w:t xml:space="preserve">37, 3648–3655 (2023).</w:t>
+      </w:r>
+    </w:p>
+    <w:p>
+      <w:pPr>
+        <w:pStyle w:val="Compact"/>
         <w:numPr>
           <w:ilvl w:val="0"/>
           <w:numId w:val="1002"/>
         </w:numPr>
       </w:pPr>
       <w:r>
-        <w:rPr>
-          <w:b/>
-          <w:bCs/>
-        </w:rPr>
-        <w:t xml:space="preserve">Expert–algorithm agreement caveats.</w:t>
-      </w:r>
-      <w:r>
-        <w:t xml:space="preserve"> </w:t>
-      </w:r>
-      <w:r>
-        <w:t xml:space="preserve">Comparison contrasts full-image visual grades with ROI-metric–derived rule classes; perfect concordance is not expected. This is not multi-human inter-grader κ.</w:t>
-      </w:r>
-    </w:p>
-    <w:p>
-      <w:pPr>
+        <w:t xml:space="preserve">Carlà, M. M. et al. MORPHOMETRIC CHANGES IN MACULAR NEOVASCULARIZATION ARCHITECTURE AFTER FARICIMAB TREATMENT IN NEOVASCULAR AGE-RELATED MACULAR DEGENERATION: Comparison Between Naive and Switched Eyes.</w:t>
+      </w:r>
+      <w:r>
+        <w:t xml:space="preserve"> </w:t>
+      </w:r>
+      <w:r>
+        <w:rPr>
+          <w:i/>
+          <w:iCs/>
+        </w:rPr>
+        <w:t xml:space="preserve">Retina</w:t>
+      </w:r>
+      <w:r>
+        <w:t xml:space="preserve"> </w:t>
+      </w:r>
+      <w:r>
+        <w:t xml:space="preserve">125–135 (2026) doi:10.1097/iae.0000000000004635.</w:t>
+      </w:r>
+    </w:p>
+    <w:p>
+      <w:pPr>
+        <w:pStyle w:val="Compact"/>
         <w:numPr>
           <w:ilvl w:val="0"/>
           <w:numId w:val="1002"/>
         </w:numPr>
       </w:pPr>
       <w:r>
-        <w:rPr>
-          <w:b/>
-          <w:bCs/>
-        </w:rPr>
-        <w:t xml:space="preserve">External validation.</w:t>
-      </w:r>
-      <w:r>
-        <w:t xml:space="preserve"> </w:t>
-      </w:r>
-      <w:r>
-        <w:t xml:space="preserve">Multi-center external validation on independent cohorts and scanners is needed before broader generalizability claims.</w:t>
-      </w:r>
-    </w:p>
-    <w:p>
-      <w:pPr>
+        <w:t xml:space="preserve">Munk, M. R. et al. OCT-angiography: A qualitative and quantitative comparison of 4 OCT-A devices.</w:t>
+      </w:r>
+      <w:r>
+        <w:t xml:space="preserve"> </w:t>
+      </w:r>
+      <w:r>
+        <w:rPr>
+          <w:i/>
+          <w:iCs/>
+        </w:rPr>
+        <w:t xml:space="preserve">PLOS ONE</w:t>
+      </w:r>
+      <w:r>
+        <w:t xml:space="preserve"> </w:t>
+      </w:r>
+      <w:r>
+        <w:t xml:space="preserve">12, e0177059 (2017).</w:t>
+      </w:r>
+    </w:p>
+    <w:p>
+      <w:pPr>
+        <w:pStyle w:val="Compact"/>
         <w:numPr>
           <w:ilvl w:val="0"/>
           <w:numId w:val="1002"/>
         </w:numPr>
       </w:pPr>
       <w:r>
-        <w:rPr>
-          <w:b/>
-          <w:bCs/>
-        </w:rPr>
-        <w:t xml:space="preserve">Equivalence testing.</w:t>
-      </w:r>
-      <w:r>
-        <w:t xml:space="preserve"> </w:t>
-      </w:r>
-      <w:r>
-        <w:t xml:space="preserve">Formal TOST was not performed because clinically meaningful margins for these novel scores were not pre-specified.</w:t>
-      </w:r>
-    </w:p>
-    <w:p>
-      <w:r>
-        <w:pict>
-          <v:rect style="width:0;height:1.5pt" o:hralign="center" o:hrstd="t" o:hr="t"/>
-        </w:pict>
-      </w:r>
-    </w:p>
-    <w:bookmarkEnd w:id="31"/>
-    <w:bookmarkEnd w:id="32"/>
-    <w:bookmarkStart w:id="33" w:name="conclusion"/>
-    <w:p>
-      <w:pPr>
-        <w:pStyle w:val="Heading2"/>
-      </w:pPr>
-      <w:r>
-        <w:t xml:space="preserve">Conclusion</w:t>
-      </w:r>
-    </w:p>
-    <w:p>
-      <w:pPr>
-        <w:pStyle w:val="FirstParagraph"/>
-      </w:pPr>
-      <w:r>
-        <w:t xml:space="preserve">We have developed a semi-automated ImageJ-/Python-based system for multi-dimensional analysis of macular neovascularization that addresses several methodological limitations of existing tools, incorporates established biomarkers from recent literature, and introduces integrated scores for complexity, caliber uniformity, and a morphology-derived maturity index. The system provides stratum-standardized scoring for cross-device</w:t>
-      </w:r>
-      <w:r>
-        <w:t xml:space="preserve"> </w:t>
-      </w:r>
-      <w:r>
-        <w:rPr>
-          <w:b/>
-          <w:bCs/>
-        </w:rPr>
-        <w:t xml:space="preserve">reporting</w:t>
-      </w:r>
-      <w:r>
-        <w:t xml:space="preserve">, disclosed rule-based morphological categorization with expert-agreement assessment, and hypothesis-generating morphology-derived interpretive labels. It does</w:t>
-      </w:r>
-      <w:r>
-        <w:t xml:space="preserve"> </w:t>
-      </w:r>
-      <w:r>
-        <w:rPr>
-          <w:b/>
-          <w:bCs/>
-        </w:rPr>
-        <w:t xml:space="preserve">not</w:t>
-      </w:r>
-      <w:r>
-        <w:t xml:space="preserve"> </w:t>
-      </w:r>
-      <w:r>
-        <w:t xml:space="preserve">establish device-independent biological equivalence of standardized scores, nor clinically validated pathophysiological disease states. With further outcome-linked and multi-center evaluation, these quantitative tools may support more reproducible research on MNV architecture in neovascular AMD.</w:t>
-      </w:r>
-    </w:p>
-    <w:p>
-      <w:r>
-        <w:pict>
-          <v:rect style="width:0;height:1.5pt" o:hralign="center" o:hrstd="t" o:hr="t"/>
-        </w:pict>
-      </w:r>
-    </w:p>
-    <w:bookmarkEnd w:id="33"/>
-    <w:bookmarkStart w:id="34" w:name="references"/>
-    <w:p>
-      <w:pPr>
-        <w:pStyle w:val="Heading2"/>
-      </w:pPr>
-      <w:r>
-        <w:t xml:space="preserve">References</w:t>
+        <w:t xml:space="preserve">Miere, A. et al. VASCULAR REMODELING OF CHOROIDAL NEOVASCULARIZATION AFTER ANTI-VASCULAR ENDOTHELIAL GROWTH FACTOR THERAPY VISUALIZED ON OPTICAL COHERENCE TOMOGRAPHY ANGIOGRAPHY.</w:t>
+      </w:r>
+      <w:r>
+        <w:t xml:space="preserve"> </w:t>
+      </w:r>
+      <w:r>
+        <w:rPr>
+          <w:i/>
+          <w:iCs/>
+        </w:rPr>
+        <w:t xml:space="preserve">Retina</w:t>
+      </w:r>
+      <w:r>
+        <w:t xml:space="preserve"> </w:t>
+      </w:r>
+      <w:r>
+        <w:t xml:space="preserve">39, 548–557 (2019).</w:t>
       </w:r>
     </w:p>
     <w:p>
@@ -2603,11 +2056,11 @@
         <w:pStyle w:val="Compact"/>
         <w:numPr>
           <w:ilvl w:val="0"/>
-          <w:numId w:val="1003"/>
+          <w:numId w:val="1002"/>
         </w:numPr>
       </w:pPr>
       <w:r>
-        <w:t xml:space="preserve">Guo, J., Tang, W., Xu, S., Liu, W. &amp; Xu, G. OCTA evaluation of treatment-naïve flat irregular PED (FIPED)-associated CNV in chronic central serous chorioretinopathy before and after half-dose PDT.</w:t>
+        <w:t xml:space="preserve">Tew, T. B. et al. Comparison of different morphologies of choroidal neovascularization evaluated by ocular coherence tomography angiography in age-related macular degeneration.</w:t>
       </w:r>
       <w:r>
         <w:t xml:space="preserve"> </w:t>
@@ -2617,13 +2070,13 @@
           <w:i/>
           <w:iCs/>
         </w:rPr>
-        <w:t xml:space="preserve">Eye</w:t>
-      </w:r>
-      <w:r>
-        <w:t xml:space="preserve"> </w:t>
-      </w:r>
-      <w:r>
-        <w:t xml:space="preserve">35, 2871–2878 (2021).</w:t>
+        <w:t xml:space="preserve">Clin. Experiment. Ophthalmol.</w:t>
+      </w:r>
+      <w:r>
+        <w:t xml:space="preserve"> </w:t>
+      </w:r>
+      <w:r>
+        <w:t xml:space="preserve">48, 927–937 (2020).</w:t>
       </w:r>
     </w:p>
     <w:p>
@@ -2631,11 +2084,11 @@
         <w:pStyle w:val="Compact"/>
         <w:numPr>
           <w:ilvl w:val="0"/>
-          <w:numId w:val="1003"/>
+          <w:numId w:val="1002"/>
         </w:numPr>
       </w:pPr>
       <w:r>
-        <w:t xml:space="preserve">Zudaire, E., Gambardella, L., Kurcz, C. &amp; Vermeren, S. A Computational Tool for Quantitative Analysis of Vascular Networks.</w:t>
+        <w:t xml:space="preserve">Coscas, F. et al. Optical coherence tomography angiography in exudative age-related macular degeneration: A predictive model for treatment decisions.</w:t>
       </w:r>
       <w:r>
         <w:t xml:space="preserve"> </w:t>
@@ -2645,13 +2098,13 @@
           <w:i/>
           <w:iCs/>
         </w:rPr>
-        <w:t xml:space="preserve">PLOS ONE</w:t>
-      </w:r>
-      <w:r>
-        <w:t xml:space="preserve"> </w:t>
-      </w:r>
-      <w:r>
-        <w:t xml:space="preserve">6, e27385 (2011).</w:t>
+        <w:t xml:space="preserve">Br. J. Ophthalmol.</w:t>
+      </w:r>
+      <w:r>
+        <w:t xml:space="preserve"> </w:t>
+      </w:r>
+      <w:r>
+        <w:t xml:space="preserve">103, 1342–1356 (2019).</w:t>
       </w:r>
     </w:p>
     <w:p>
@@ -2659,11 +2112,11 @@
         <w:pStyle w:val="Compact"/>
         <w:numPr>
           <w:ilvl w:val="0"/>
-          <w:numId w:val="1003"/>
+          <w:numId w:val="1002"/>
         </w:numPr>
       </w:pPr>
       <w:r>
-        <w:t xml:space="preserve">Told, R. et al. Profiling neovascular age-related macular degeneration choroidal neovascularization lesion response to anti-vascular endothelial growth factor therapy using SSOCTA.</w:t>
+        <w:t xml:space="preserve">Oliveira, W. S., Teixeira, J. V., Ren, T. I., Cavalcanti, G. D. C. &amp; Sijbers, J. Unsupervised Retinal Vessel Segmentation Using Combined Filters.</w:t>
       </w:r>
       <w:r>
         <w:t xml:space="preserve"> </w:t>
@@ -2673,13 +2126,13 @@
           <w:i/>
           <w:iCs/>
         </w:rPr>
-        <w:t xml:space="preserve">Acta Ophthalmol. (Copenh.)</w:t>
-      </w:r>
-      <w:r>
-        <w:t xml:space="preserve"> </w:t>
-      </w:r>
-      <w:r>
-        <w:t xml:space="preserve">99, e240–e246 (2021).</w:t>
+        <w:t xml:space="preserve">PLoS ONE</w:t>
+      </w:r>
+      <w:r>
+        <w:t xml:space="preserve"> </w:t>
+      </w:r>
+      <w:r>
+        <w:t xml:space="preserve">11, e0149943 (2016).</w:t>
       </w:r>
     </w:p>
     <w:p>
@@ -2687,11 +2140,11 @@
         <w:pStyle w:val="Compact"/>
         <w:numPr>
           <w:ilvl w:val="0"/>
-          <w:numId w:val="1003"/>
+          <w:numId w:val="1002"/>
         </w:numPr>
       </w:pPr>
       <w:r>
-        <w:t xml:space="preserve">Montesel, A. et al. Quantitative response of macular neovascularisation to loading phase of aflibercept in neovascular age-related macular degeneration.</w:t>
+        <w:t xml:space="preserve">Ma, Y. et al. Multichannel Retinal Blood Vessel Segmentation Based on the Combination of Matched Filter and U-Net Network.</w:t>
       </w:r>
       <w:r>
         <w:t xml:space="preserve"> </w:t>
@@ -2701,13 +2154,13 @@
           <w:i/>
           <w:iCs/>
         </w:rPr>
-        <w:t xml:space="preserve">Eye</w:t>
-      </w:r>
-      <w:r>
-        <w:t xml:space="preserve"> </w:t>
-      </w:r>
-      <w:r>
-        <w:t xml:space="preserve">37, 3648–3655 (2023).</w:t>
+        <w:t xml:space="preserve">BioMed Res. Int.</w:t>
+      </w:r>
+      <w:r>
+        <w:t xml:space="preserve"> </w:t>
+      </w:r>
+      <w:r>
+        <w:t xml:space="preserve">2021, 5561125 (2021).</w:t>
       </w:r>
     </w:p>
     <w:p>
@@ -2715,11 +2168,11 @@
         <w:pStyle w:val="Compact"/>
         <w:numPr>
           <w:ilvl w:val="0"/>
-          <w:numId w:val="1003"/>
+          <w:numId w:val="1002"/>
         </w:numPr>
       </w:pPr>
       <w:r>
-        <w:t xml:space="preserve">Carlà, M. M. et al. MORPHOMETRIC CHANGES IN MACULAR NEOVASCULARIZATION ARCHITECTURE AFTER FARICIMAB TREATMENT IN NEOVASCULAR AGE-RELATED MACULAR DEGENERATION: Comparison Between Naive and Switched Eyes.</w:t>
+        <w:t xml:space="preserve">Memari, N., Ramli, A. R., Bin Saripan, M. I., Mashohor, S. &amp; Moghbel, M. Supervised retinal vessel segmentation from color fundus images based on matched filtering and AdaBoost classifier.</w:t>
       </w:r>
       <w:r>
         <w:t xml:space="preserve"> </w:t>
@@ -2729,13 +2182,13 @@
           <w:i/>
           <w:iCs/>
         </w:rPr>
-        <w:t xml:space="preserve">Retina</w:t>
-      </w:r>
-      <w:r>
-        <w:t xml:space="preserve"> </w:t>
-      </w:r>
-      <w:r>
-        <w:t xml:space="preserve">125–135 (2026) doi:10.1097/iae.0000000000004635.</w:t>
+        <w:t xml:space="preserve">PLoS ONE</w:t>
+      </w:r>
+      <w:r>
+        <w:t xml:space="preserve"> </w:t>
+      </w:r>
+      <w:r>
+        <w:t xml:space="preserve">12, e0188939 (2017).</w:t>
       </w:r>
     </w:p>
     <w:p>
@@ -2743,11 +2196,11 @@
         <w:pStyle w:val="Compact"/>
         <w:numPr>
           <w:ilvl w:val="0"/>
-          <w:numId w:val="1003"/>
+          <w:numId w:val="1002"/>
         </w:numPr>
       </w:pPr>
       <w:r>
-        <w:t xml:space="preserve">Munk, M. R. et al. OCT-angiography: A qualitative and quantitative comparison of 4 OCT-A devices.</w:t>
+        <w:t xml:space="preserve">Wang, M. et al. Evaluating Polypoidal Choroidal Vasculopathy With Optical Coherence Tomography Angiography.</w:t>
       </w:r>
       <w:r>
         <w:t xml:space="preserve"> </w:t>
@@ -2757,13 +2210,13 @@
           <w:i/>
           <w:iCs/>
         </w:rPr>
-        <w:t xml:space="preserve">PLOS ONE</w:t>
-      </w:r>
-      <w:r>
-        <w:t xml:space="preserve"> </w:t>
-      </w:r>
-      <w:r>
-        <w:t xml:space="preserve">12, e0177059 (2017).</w:t>
+        <w:t xml:space="preserve">Investig. Opthalmology Vis. Sci.</w:t>
+      </w:r>
+      <w:r>
+        <w:t xml:space="preserve"> </w:t>
+      </w:r>
+      <w:r>
+        <w:t xml:space="preserve">57, OCT526-32 (2016).</w:t>
       </w:r>
     </w:p>
     <w:p>
@@ -2771,11 +2224,11 @@
         <w:pStyle w:val="Compact"/>
         <w:numPr>
           <w:ilvl w:val="0"/>
-          <w:numId w:val="1003"/>
+          <w:numId w:val="1002"/>
         </w:numPr>
       </w:pPr>
       <w:r>
-        <w:t xml:space="preserve">Miere, A. et al. VASCULAR REMODELING OF CHOROIDAL NEOVASCULARIZATION AFTER ANTI-VASCULAR ENDOTHELIAL GROWTH FACTOR THERAPY VISUALIZED ON OPTICAL COHERENCE TOMOGRAPHY ANGIOGRAPHY.</w:t>
+        <w:t xml:space="preserve">Xue, J. et al. Automatic quantification of choroidal neovascularization lesion area on OCT angiography based on density cell-like P systems with active membranes.</w:t>
       </w:r>
       <w:r>
         <w:t xml:space="preserve"> </w:t>
@@ -2785,13 +2238,13 @@
           <w:i/>
           <w:iCs/>
         </w:rPr>
-        <w:t xml:space="preserve">Retina</w:t>
-      </w:r>
-      <w:r>
-        <w:t xml:space="preserve"> </w:t>
-      </w:r>
-      <w:r>
-        <w:t xml:space="preserve">39, 548–557 (2019).</w:t>
+        <w:t xml:space="preserve">Biomed. Opt. Express</w:t>
+      </w:r>
+      <w:r>
+        <w:t xml:space="preserve"> </w:t>
+      </w:r>
+      <w:r>
+        <w:t xml:space="preserve">9, 3208–3219 (2018).</w:t>
       </w:r>
     </w:p>
     <w:p>
@@ -2799,11 +2252,11 @@
         <w:pStyle w:val="Compact"/>
         <w:numPr>
           <w:ilvl w:val="0"/>
-          <w:numId w:val="1003"/>
+          <w:numId w:val="1002"/>
         </w:numPr>
       </w:pPr>
       <w:r>
-        <w:t xml:space="preserve">Tew, T. B. et al. Comparison of different morphologies of choroidal neovascularization evaluated by ocular coherence tomography angiography in age-related macular degeneration.</w:t>
+        <w:t xml:space="preserve">Babiuch, A. et al. IMPACT OF OPTICAL COHERENCE TOMOGRAPHY ANGIOGRAPHY REVIEW STRATEGY ON DETECTION OF CHOROIDAL NEOVASCULARIZATION.</w:t>
       </w:r>
       <w:r>
         <w:t xml:space="preserve"> </w:t>
@@ -2813,13 +2266,13 @@
           <w:i/>
           <w:iCs/>
         </w:rPr>
-        <w:t xml:space="preserve">Clin. Experiment. Ophthalmol.</w:t>
-      </w:r>
-      <w:r>
-        <w:t xml:space="preserve"> </w:t>
-      </w:r>
-      <w:r>
-        <w:t xml:space="preserve">48, 927–937 (2020).</w:t>
+        <w:t xml:space="preserve">Retina</w:t>
+      </w:r>
+      <w:r>
+        <w:t xml:space="preserve"> </w:t>
+      </w:r>
+      <w:r>
+        <w:t xml:space="preserve">672–678 (2020) doi:10.1097/iae.0000000000002443.</w:t>
       </w:r>
     </w:p>
     <w:p>
@@ -2827,11 +2280,11 @@
         <w:pStyle w:val="Compact"/>
         <w:numPr>
           <w:ilvl w:val="0"/>
-          <w:numId w:val="1003"/>
+          <w:numId w:val="1002"/>
         </w:numPr>
       </w:pPr>
       <w:r>
-        <w:t xml:space="preserve">Coscas, F. et al. Optical coherence tomography angiography in exudative age-related macular degeneration: A predictive model for treatment decisions.</w:t>
+        <w:t xml:space="preserve">Smith, A. &amp; Zavala, V. The Euler characteristic: A general topological descriptor for complex data.</w:t>
       </w:r>
       <w:r>
         <w:t xml:space="preserve"> </w:t>
@@ -2841,13 +2294,13 @@
           <w:i/>
           <w:iCs/>
         </w:rPr>
-        <w:t xml:space="preserve">Br. J. Ophthalmol.</w:t>
-      </w:r>
-      <w:r>
-        <w:t xml:space="preserve"> </w:t>
-      </w:r>
-      <w:r>
-        <w:t xml:space="preserve">103, 1342–1356 (2019).</w:t>
+        <w:t xml:space="preserve">Comput Chem Eng</w:t>
+      </w:r>
+      <w:r>
+        <w:t xml:space="preserve"> </w:t>
+      </w:r>
+      <w:r>
+        <w:t xml:space="preserve">154, 107463 (2021).</w:t>
       </w:r>
     </w:p>
     <w:p>
@@ -2855,11 +2308,11 @@
         <w:pStyle w:val="Compact"/>
         <w:numPr>
           <w:ilvl w:val="0"/>
-          <w:numId w:val="1003"/>
+          <w:numId w:val="1002"/>
         </w:numPr>
       </w:pPr>
       <w:r>
-        <w:t xml:space="preserve">Oliveira, W. S., Teixeira, J. V., Ren, T. I., Cavalcanti, G. D. C. &amp; Sijbers, J. Unsupervised Retinal Vessel Segmentation Using Combined Filters.</w:t>
+        <w:t xml:space="preserve">Willführ, A. et al. Estimation of the number of alveolar capillaries by the Euler number (Euler-Poincaré characteristic).</w:t>
       </w:r>
       <w:r>
         <w:t xml:space="preserve"> </w:t>
@@ -2869,13 +2322,13 @@
           <w:i/>
           <w:iCs/>
         </w:rPr>
-        <w:t xml:space="preserve">PLoS ONE</w:t>
-      </w:r>
-      <w:r>
-        <w:t xml:space="preserve"> </w:t>
-      </w:r>
-      <w:r>
-        <w:t xml:space="preserve">11, e0149943 (2016).</w:t>
+        <w:t xml:space="preserve">Am. J. Physiol. Lung Cell. Mol. Physiol.</w:t>
+      </w:r>
+      <w:r>
+        <w:t xml:space="preserve"> </w:t>
+      </w:r>
+      <w:r>
+        <w:t xml:space="preserve">309, L1286-93 (2015).</w:t>
       </w:r>
     </w:p>
     <w:p>
@@ -2883,11 +2336,11 @@
         <w:pStyle w:val="Compact"/>
         <w:numPr>
           <w:ilvl w:val="0"/>
-          <w:numId w:val="1003"/>
+          <w:numId w:val="1002"/>
         </w:numPr>
       </w:pPr>
       <w:r>
-        <w:t xml:space="preserve">Ma, Y. et al. Multichannel Retinal Blood Vessel Segmentation Based on the Combination of Matched Filter and U-Net Network.</w:t>
+        <w:t xml:space="preserve">Santos, F. et al. Topological phase transitions in functional brain networks.</w:t>
       </w:r>
       <w:r>
         <w:t xml:space="preserve"> </w:t>
@@ -2897,13 +2350,13 @@
           <w:i/>
           <w:iCs/>
         </w:rPr>
-        <w:t xml:space="preserve">BioMed Res. Int.</w:t>
-      </w:r>
-      <w:r>
-        <w:t xml:space="preserve"> </w:t>
-      </w:r>
-      <w:r>
-        <w:t xml:space="preserve">2021, 5561125 (2021).</w:t>
+        <w:t xml:space="preserve">bioRxiv</w:t>
+      </w:r>
+      <w:r>
+        <w:t xml:space="preserve"> </w:t>
+      </w:r>
+      <w:r>
+        <w:t xml:space="preserve">https://doi.org/10.1101/469478 (2018) doi:10.1101/469478.</w:t>
       </w:r>
     </w:p>
     <w:p>
@@ -2911,11 +2364,11 @@
         <w:pStyle w:val="Compact"/>
         <w:numPr>
           <w:ilvl w:val="0"/>
-          <w:numId w:val="1003"/>
+          <w:numId w:val="1002"/>
         </w:numPr>
       </w:pPr>
       <w:r>
-        <w:t xml:space="preserve">Memari, N., Ramli, A. R., Bin Saripan, M. I., Mashohor, S. &amp; Moghbel, M. Supervised retinal vessel segmentation from color fundus images based on matched filtering and AdaBoost classifier.</w:t>
+        <w:t xml:space="preserve">Viallard, C. &amp; Larrivée, B. Tumor angiogenesis and vascular normalization: alternative therapeutic targets.</w:t>
       </w:r>
       <w:r>
         <w:t xml:space="preserve"> </w:t>
@@ -2925,13 +2378,13 @@
           <w:i/>
           <w:iCs/>
         </w:rPr>
-        <w:t xml:space="preserve">PLoS ONE</w:t>
-      </w:r>
-      <w:r>
-        <w:t xml:space="preserve"> </w:t>
-      </w:r>
-      <w:r>
-        <w:t xml:space="preserve">12, e0188939 (2017).</w:t>
+        <w:t xml:space="preserve">Angiogenesis</w:t>
+      </w:r>
+      <w:r>
+        <w:t xml:space="preserve"> </w:t>
+      </w:r>
+      <w:r>
+        <w:t xml:space="preserve">20, 409–426 (2017).</w:t>
       </w:r>
     </w:p>
     <w:p>
@@ -2939,11 +2392,11 @@
         <w:pStyle w:val="Compact"/>
         <w:numPr>
           <w:ilvl w:val="0"/>
-          <w:numId w:val="1003"/>
+          <w:numId w:val="1002"/>
         </w:numPr>
       </w:pPr>
       <w:r>
-        <w:t xml:space="preserve">Wang, M. et al. Evaluating Polypoidal Choroidal Vasculopathy With Optical Coherence Tomography Angiography.</w:t>
+        <w:t xml:space="preserve">Goker, Y. S. &amp; Demir, G. Comparison of optical coherence tomography angiography features in type 1 versus type 2 choroidal neovascular membranes secondary to age-related macular degeneration.</w:t>
       </w:r>
       <w:r>
         <w:t xml:space="preserve"> </w:t>
@@ -2953,13 +2406,13 @@
           <w:i/>
           <w:iCs/>
         </w:rPr>
-        <w:t xml:space="preserve">Investig. Opthalmology Vis. Sci.</w:t>
-      </w:r>
-      <w:r>
-        <w:t xml:space="preserve"> </w:t>
-      </w:r>
-      <w:r>
-        <w:t xml:space="preserve">57, OCT526-32 (2016).</w:t>
+        <w:t xml:space="preserve">Med. Hypothesis Discov. Innov. Ophthalmol. J.</w:t>
+      </w:r>
+      <w:r>
+        <w:t xml:space="preserve"> </w:t>
+      </w:r>
+      <w:r>
+        <w:t xml:space="preserve">10, 67–73 (2021).</w:t>
       </w:r>
     </w:p>
     <w:p>
@@ -2967,11 +2420,11 @@
         <w:pStyle w:val="Compact"/>
         <w:numPr>
           <w:ilvl w:val="0"/>
-          <w:numId w:val="1003"/>
+          <w:numId w:val="1002"/>
         </w:numPr>
       </w:pPr>
       <w:r>
-        <w:t xml:space="preserve">Xue, J. et al. Automatic quantification of choroidal neovascularization lesion area on OCT angiography based on density cell-like P systems with active membranes.</w:t>
+        <w:t xml:space="preserve">Li, J. et al. Comparative quantitative analysis of optical coherence tomography angiography in varied morphologies of macular neovascularization following intravitreal conbercept and ranibizumab treatments for neovascular age‑related macular degeneration.</w:t>
       </w:r>
       <w:r>
         <w:t xml:space="preserve"> </w:t>
@@ -2981,13 +2434,13 @@
           <w:i/>
           <w:iCs/>
         </w:rPr>
-        <w:t xml:space="preserve">Biomed. Opt. Express</w:t>
-      </w:r>
-      <w:r>
-        <w:t xml:space="preserve"> </w:t>
-      </w:r>
-      <w:r>
-        <w:t xml:space="preserve">9, 3208–3219 (2018).</w:t>
+        <w:t xml:space="preserve">Exp. Ther. Med.</w:t>
+      </w:r>
+      <w:r>
+        <w:t xml:space="preserve"> </w:t>
+      </w:r>
+      <w:r>
+        <w:t xml:space="preserve">27, 214 (2024).</w:t>
       </w:r>
     </w:p>
     <w:p>
@@ -2995,11 +2448,11 @@
         <w:pStyle w:val="Compact"/>
         <w:numPr>
           <w:ilvl w:val="0"/>
-          <w:numId w:val="1003"/>
+          <w:numId w:val="1002"/>
         </w:numPr>
       </w:pPr>
       <w:r>
-        <w:t xml:space="preserve">Babiuch, A. et al. IMPACT OF OPTICAL COHERENCE TOMOGRAPHY ANGIOGRAPHY REVIEW STRATEGY ON DETECTION OF CHOROIDAL NEOVASCULARIZATION.</w:t>
+        <w:t xml:space="preserve">Mettu, P. S., Allingham, M. J. &amp; Cousins, S. W. Incomplete response to Anti-VEGF therapy in neovascular AMD: Exploring disease mechanisms and therapeutic opportunities.</w:t>
       </w:r>
       <w:r>
         <w:t xml:space="preserve"> </w:t>
@@ -3009,13 +2462,13 @@
           <w:i/>
           <w:iCs/>
         </w:rPr>
-        <w:t xml:space="preserve">Retina</w:t>
-      </w:r>
-      <w:r>
-        <w:t xml:space="preserve"> </w:t>
-      </w:r>
-      <w:r>
-        <w:t xml:space="preserve">672–678 (2020) doi:10.1097/iae.0000000000002443.</w:t>
+        <w:t xml:space="preserve">Prog. Retin. Eye Res.</w:t>
+      </w:r>
+      <w:r>
+        <w:t xml:space="preserve"> </w:t>
+      </w:r>
+      <w:r>
+        <w:t xml:space="preserve">82, 100906 (2021).</w:t>
       </w:r>
     </w:p>
     <w:p>
@@ -3023,11 +2476,11 @@
         <w:pStyle w:val="Compact"/>
         <w:numPr>
           <w:ilvl w:val="0"/>
-          <w:numId w:val="1003"/>
+          <w:numId w:val="1002"/>
         </w:numPr>
       </w:pPr>
       <w:r>
-        <w:t xml:space="preserve">Smith, A. &amp; Zavala, V. The Euler characteristic: A general topological descriptor for complex data.</w:t>
+        <w:t xml:space="preserve">Attarde, A., Riad, T., Zhang, Z., Ahir, M. &amp; Fu, Y. Characterization of Vascular Morphology of Neovascular Age-Related Macular Degeneration by Indocyanine Green Angiography.</w:t>
       </w:r>
       <w:r>
         <w:t xml:space="preserve"> </w:t>
@@ -3037,13 +2490,13 @@
           <w:i/>
           <w:iCs/>
         </w:rPr>
-        <w:t xml:space="preserve">Comput Chem Eng</w:t>
-      </w:r>
-      <w:r>
-        <w:t xml:space="preserve"> </w:t>
-      </w:r>
-      <w:r>
-        <w:t xml:space="preserve">154, 107463 (2021).</w:t>
+        <w:t xml:space="preserve">J. Vis. Exp. JoVE</w:t>
+      </w:r>
+      <w:r>
+        <w:t xml:space="preserve"> </w:t>
+      </w:r>
+      <w:r>
+        <w:t xml:space="preserve">198, (2023).</w:t>
       </w:r>
     </w:p>
     <w:p>
@@ -3051,11 +2504,11 @@
         <w:pStyle w:val="Compact"/>
         <w:numPr>
           <w:ilvl w:val="0"/>
-          <w:numId w:val="1003"/>
+          <w:numId w:val="1002"/>
         </w:numPr>
       </w:pPr>
       <w:r>
-        <w:t xml:space="preserve">Willführ, A. et al. Estimation of the number of alveolar capillaries by the Euler number (Euler-Poincaré characteristic).</w:t>
+        <w:t xml:space="preserve">Fu, Y., Zhang, Z., Webster, K. &amp; Paulus, Y. Treatment Strategies for Anti-VEGF Resistance in Neovascular Age-Related Macular Degeneration by Targeting Arteriolar Choroidal Neovascularization.</w:t>
       </w:r>
       <w:r>
         <w:t xml:space="preserve"> </w:t>
@@ -3065,13 +2518,13 @@
           <w:i/>
           <w:iCs/>
         </w:rPr>
-        <w:t xml:space="preserve">Am. J. Physiol. Lung Cell. Mol. Physiol.</w:t>
-      </w:r>
-      <w:r>
-        <w:t xml:space="preserve"> </w:t>
-      </w:r>
-      <w:r>
-        <w:t xml:space="preserve">309, L1286-93 (2015).</w:t>
+        <w:t xml:space="preserve">Biomolecules</w:t>
+      </w:r>
+      <w:r>
+        <w:t xml:space="preserve"> </w:t>
+      </w:r>
+      <w:r>
+        <w:t xml:space="preserve">14, 252 (2024).</w:t>
       </w:r>
     </w:p>
     <w:p>
@@ -3079,11 +2532,11 @@
         <w:pStyle w:val="Compact"/>
         <w:numPr>
           <w:ilvl w:val="0"/>
-          <w:numId w:val="1003"/>
+          <w:numId w:val="1002"/>
         </w:numPr>
       </w:pPr>
       <w:r>
-        <w:t xml:space="preserve">Santos, F. et al. Topological phase transitions in functional brain networks.</w:t>
+        <w:t xml:space="preserve">Spaide, R. Optical Coherence Tomography Angiography Signs of Vascular Abnormalization With Antiangiogenic Therapy for Choroidal Neovascularization.</w:t>
       </w:r>
       <w:r>
         <w:t xml:space="preserve"> </w:t>
@@ -3093,13 +2546,13 @@
           <w:i/>
           <w:iCs/>
         </w:rPr>
-        <w:t xml:space="preserve">bioRxiv</w:t>
-      </w:r>
-      <w:r>
-        <w:t xml:space="preserve"> </w:t>
-      </w:r>
-      <w:r>
-        <w:t xml:space="preserve">https://doi.org/10.1101/469478 (2018) doi:10.1101/469478.</w:t>
+        <w:t xml:space="preserve">Am. J. Ophthalmol.</w:t>
+      </w:r>
+      <w:r>
+        <w:t xml:space="preserve"> </w:t>
+      </w:r>
+      <w:r>
+        <w:t xml:space="preserve">160, 6–16 (2015).</w:t>
       </w:r>
     </w:p>
     <w:p>
@@ -3107,11 +2560,11 @@
         <w:pStyle w:val="Compact"/>
         <w:numPr>
           <w:ilvl w:val="0"/>
-          <w:numId w:val="1003"/>
+          <w:numId w:val="1002"/>
         </w:numPr>
       </w:pPr>
       <w:r>
-        <w:t xml:space="preserve">Viallard, C. &amp; Larrivée, B. Tumor angiogenesis and vascular normalization: alternative therapeutic targets.</w:t>
+        <w:t xml:space="preserve">Shah, P. N. et al. Inter-rater reliability of proliferative diabetic retinopathy assessment on wide-field OCT-angiography and fluorescein angiography.</w:t>
       </w:r>
       <w:r>
         <w:t xml:space="preserve"> </w:t>
@@ -3121,13 +2574,13 @@
           <w:i/>
           <w:iCs/>
         </w:rPr>
-        <w:t xml:space="preserve">Angiogenesis</w:t>
-      </w:r>
-      <w:r>
-        <w:t xml:space="preserve"> </w:t>
-      </w:r>
-      <w:r>
-        <w:t xml:space="preserve">20, 409–426 (2017).</w:t>
+        <w:t xml:space="preserve">Transl. Vis. Sci. Technol.</w:t>
+      </w:r>
+      <w:r>
+        <w:t xml:space="preserve"> </w:t>
+      </w:r>
+      <w:r>
+        <w:t xml:space="preserve">12(7), 13 (2023).</w:t>
       </w:r>
     </w:p>
     <w:p>
@@ -3135,11 +2588,11 @@
         <w:pStyle w:val="Compact"/>
         <w:numPr>
           <w:ilvl w:val="0"/>
-          <w:numId w:val="1003"/>
+          <w:numId w:val="1002"/>
         </w:numPr>
       </w:pPr>
       <w:r>
-        <w:t xml:space="preserve">Goker, Y. S. &amp; Demir, G. Comparison of optical coherence tomography angiography features in type 1 versus type 2 choroidal neovascular membranes secondary to age-related macular degeneration.</w:t>
+        <w:t xml:space="preserve">Deák, G. G. et al. Comparison of optical coherence tomography vs. fluorescein angiography-based macular neovascularization classifications in age-related macular degeneration.</w:t>
       </w:r>
       <w:r>
         <w:t xml:space="preserve"> </w:t>
@@ -3149,13 +2602,13 @@
           <w:i/>
           <w:iCs/>
         </w:rPr>
-        <w:t xml:space="preserve">Med. Hypothesis Discov. Innov. Ophthalmol. J.</w:t>
-      </w:r>
-      <w:r>
-        <w:t xml:space="preserve"> </w:t>
-      </w:r>
-      <w:r>
-        <w:t xml:space="preserve">10, 67–73 (2021).</w:t>
+        <w:t xml:space="preserve">Sci. Rep.</w:t>
+      </w:r>
+      <w:r>
+        <w:t xml:space="preserve"> </w:t>
+      </w:r>
+      <w:r>
+        <w:t xml:space="preserve">15, 87576 (2025) doi:10.1038/s41598-025-87576-6.</w:t>
       </w:r>
     </w:p>
     <w:p>
@@ -3163,11 +2616,11 @@
         <w:pStyle w:val="Compact"/>
         <w:numPr>
           <w:ilvl w:val="0"/>
-          <w:numId w:val="1003"/>
+          <w:numId w:val="1002"/>
         </w:numPr>
       </w:pPr>
       <w:r>
-        <w:t xml:space="preserve">Li, J. et al. Comparative quantitative analysis of optical coherence tomography angiography in varied morphologies of macular neovascularization following intravitreal conbercept and ranibizumab treatments for neovascular age‑related macular degeneration.</w:t>
+        <w:t xml:space="preserve">Corvi, F. et al. Reproducibility of vessel density, fractal dimension, and foveal avascular zone using 7 different optical coherence tomography angiography devices.</w:t>
       </w:r>
       <w:r>
         <w:t xml:space="preserve"> </w:t>
@@ -3177,13 +2630,13 @@
           <w:i/>
           <w:iCs/>
         </w:rPr>
-        <w:t xml:space="preserve">Exp. Ther. Med.</w:t>
-      </w:r>
-      <w:r>
-        <w:t xml:space="preserve"> </w:t>
-      </w:r>
-      <w:r>
-        <w:t xml:space="preserve">27, 214 (2024).</w:t>
+        <w:t xml:space="preserve">Am. J. Ophthalmol.</w:t>
+      </w:r>
+      <w:r>
+        <w:t xml:space="preserve"> </w:t>
+      </w:r>
+      <w:r>
+        <w:t xml:space="preserve">186, 25–31 (2018).</w:t>
       </w:r>
     </w:p>
     <w:p>
@@ -3191,11 +2644,11 @@
         <w:pStyle w:val="Compact"/>
         <w:numPr>
           <w:ilvl w:val="0"/>
-          <w:numId w:val="1003"/>
+          <w:numId w:val="1002"/>
         </w:numPr>
       </w:pPr>
       <w:r>
-        <w:t xml:space="preserve">Mettu, P. S., Allingham, M. J. &amp; Cousins, S. W. Incomplete response to Anti-VEGF therapy in neovascular AMD: Exploring disease mechanisms and therapeutic opportunities.</w:t>
+        <w:t xml:space="preserve">Corvi, F. et al. Comparison between several optical coherence tomography angiography devices and indocyanine green angiography of choroidal neovascularization.</w:t>
       </w:r>
       <w:r>
         <w:t xml:space="preserve"> </w:t>
@@ -3205,13 +2658,13 @@
           <w:i/>
           <w:iCs/>
         </w:rPr>
-        <w:t xml:space="preserve">Prog. Retin. Eye Res.</w:t>
-      </w:r>
-      <w:r>
-        <w:t xml:space="preserve"> </w:t>
-      </w:r>
-      <w:r>
-        <w:t xml:space="preserve">82, 100906 (2021).</w:t>
+        <w:t xml:space="preserve">Retina</w:t>
+      </w:r>
+      <w:r>
+        <w:t xml:space="preserve"> </w:t>
+      </w:r>
+      <w:r>
+        <w:t xml:space="preserve">40, 873–880 (2020).</w:t>
       </w:r>
     </w:p>
     <w:p>
@@ -3219,11 +2672,11 @@
         <w:pStyle w:val="Compact"/>
         <w:numPr>
           <w:ilvl w:val="0"/>
-          <w:numId w:val="1003"/>
+          <w:numId w:val="1002"/>
         </w:numPr>
       </w:pPr>
       <w:r>
-        <w:t xml:space="preserve">Attarde, A., Riad, T., Zhang, Z., Ahir, M. &amp; Fu, Y. Characterization of Vascular Morphology of Neovascular Age-Related Macular Degeneration by Indocyanine Green Angiography.</w:t>
+        <w:t xml:space="preserve">Gan, Y. et al. Novel quantitative OCTA biomarkers of choroidal neovascularization and associations with disease activity and etiology.</w:t>
       </w:r>
       <w:r>
         <w:t xml:space="preserve"> </w:t>
@@ -3233,13 +2686,13 @@
           <w:i/>
           <w:iCs/>
         </w:rPr>
-        <w:t xml:space="preserve">J. Vis. Exp. JoVE</w:t>
-      </w:r>
-      <w:r>
-        <w:t xml:space="preserve"> </w:t>
-      </w:r>
-      <w:r>
-        <w:t xml:space="preserve">198, (2023).</w:t>
+        <w:t xml:space="preserve">Transl. Vis. Sci. Technol.</w:t>
+      </w:r>
+      <w:r>
+        <w:t xml:space="preserve"> </w:t>
+      </w:r>
+      <w:r>
+        <w:t xml:space="preserve">15(3), 10 (2026).</w:t>
       </w:r>
     </w:p>
     <w:p>
@@ -3247,11 +2700,11 @@
         <w:pStyle w:val="Compact"/>
         <w:numPr>
           <w:ilvl w:val="0"/>
-          <w:numId w:val="1003"/>
+          <w:numId w:val="1002"/>
         </w:numPr>
       </w:pPr>
       <w:r>
-        <w:t xml:space="preserve">Fu, Y., Zhang, Z., Webster, K. &amp; Paulus, Y. Treatment Strategies for Anti-VEGF Resistance in Neovascular Age-Related Macular Degeneration by Targeting Arteriolar Choroidal Neovascularization.</w:t>
+        <w:t xml:space="preserve">Hsu, C. R. et al. Combined quantitative and qualitative optical coherence tomography angiography biomarkers for predicting active neovascular age-related macular degeneration.</w:t>
       </w:r>
       <w:r>
         <w:t xml:space="preserve"> </w:t>
@@ -3261,13 +2714,13 @@
           <w:i/>
           <w:iCs/>
         </w:rPr>
-        <w:t xml:space="preserve">Biomolecules</w:t>
-      </w:r>
-      <w:r>
-        <w:t xml:space="preserve"> </w:t>
-      </w:r>
-      <w:r>
-        <w:t xml:space="preserve">14, 252 (2024).</w:t>
+        <w:t xml:space="preserve">Sci. Rep.</w:t>
+      </w:r>
+      <w:r>
+        <w:t xml:space="preserve"> </w:t>
+      </w:r>
+      <w:r>
+        <w:t xml:space="preserve">11, 18068 (2021).</w:t>
       </w:r>
     </w:p>
     <w:p>
@@ -3275,11 +2728,11 @@
         <w:pStyle w:val="Compact"/>
         <w:numPr>
           <w:ilvl w:val="0"/>
-          <w:numId w:val="1003"/>
+          <w:numId w:val="1002"/>
         </w:numPr>
       </w:pPr>
       <w:r>
-        <w:t xml:space="preserve">Spaide, R. Optical Coherence Tomography Angiography Signs of Vascular Abnormalization With Antiangiogenic Therapy for Choroidal Neovascularization.</w:t>
+        <w:t xml:space="preserve">Shrout, P. E. &amp; Fleiss, J. L. Intraclass correlations: uses in assessing rater reliability.</w:t>
       </w:r>
       <w:r>
         <w:t xml:space="preserve"> </w:t>
@@ -3289,13 +2742,13 @@
           <w:i/>
           <w:iCs/>
         </w:rPr>
-        <w:t xml:space="preserve">Am. J. Ophthalmol.</w:t>
-      </w:r>
-      <w:r>
-        <w:t xml:space="preserve"> </w:t>
-      </w:r>
-      <w:r>
-        <w:t xml:space="preserve">160, 6–16 (2015).</w:t>
+        <w:t xml:space="preserve">Psychol. Bull.</w:t>
+      </w:r>
+      <w:r>
+        <w:t xml:space="preserve"> </w:t>
+      </w:r>
+      <w:r>
+        <w:t xml:space="preserve">86, 420–428 (1979).</w:t>
       </w:r>
     </w:p>
     <w:p>
@@ -3303,11 +2756,11 @@
         <w:pStyle w:val="Compact"/>
         <w:numPr>
           <w:ilvl w:val="0"/>
-          <w:numId w:val="1003"/>
+          <w:numId w:val="1002"/>
         </w:numPr>
       </w:pPr>
       <w:r>
-        <w:t xml:space="preserve">Shah, P. N. et al. Inter-rater reliability of proliferative diabetic retinopathy assessment on wide-field OCT-angiography and fluorescein angiography.</w:t>
+        <w:t xml:space="preserve">McGraw, K. O. &amp; Wong, S. P. Forming inferences about some intraclass correlation coefficients.</w:t>
       </w:r>
       <w:r>
         <w:t xml:space="preserve"> </w:t>
@@ -3317,13 +2770,13 @@
           <w:i/>
           <w:iCs/>
         </w:rPr>
-        <w:t xml:space="preserve">Transl. Vis. Sci. Technol.</w:t>
-      </w:r>
-      <w:r>
-        <w:t xml:space="preserve"> </w:t>
-      </w:r>
-      <w:r>
-        <w:t xml:space="preserve">12(7), 13 (2023).</w:t>
+        <w:t xml:space="preserve">Psychol. Methods</w:t>
+      </w:r>
+      <w:r>
+        <w:t xml:space="preserve"> </w:t>
+      </w:r>
+      <w:r>
+        <w:t xml:space="preserve">1, 30–46 (1996).</w:t>
       </w:r>
     </w:p>
     <w:p>
@@ -3331,203 +2784,7 @@
         <w:pStyle w:val="Compact"/>
         <w:numPr>
           <w:ilvl w:val="0"/>
-          <w:numId w:val="1003"/>
-        </w:numPr>
-      </w:pPr>
-      <w:r>
-        <w:t xml:space="preserve">Deák, G. G. et al. Comparison of optical coherence tomography vs. fluorescein angiography-based macular neovascularization classifications in age-related macular degeneration.</w:t>
-      </w:r>
-      <w:r>
-        <w:t xml:space="preserve"> </w:t>
-      </w:r>
-      <w:r>
-        <w:rPr>
-          <w:i/>
-          <w:iCs/>
-        </w:rPr>
-        <w:t xml:space="preserve">Sci. Rep.</w:t>
-      </w:r>
-      <w:r>
-        <w:t xml:space="preserve"> </w:t>
-      </w:r>
-      <w:r>
-        <w:t xml:space="preserve">15, 87576 (2025) doi:10.1038/s41598-025-87576-6.</w:t>
-      </w:r>
-    </w:p>
-    <w:p>
-      <w:pPr>
-        <w:pStyle w:val="Compact"/>
-        <w:numPr>
-          <w:ilvl w:val="0"/>
-          <w:numId w:val="1003"/>
-        </w:numPr>
-      </w:pPr>
-      <w:r>
-        <w:t xml:space="preserve">Corvi, F. et al. Reproducibility of vessel density, fractal dimension, and foveal avascular zone using 7 different optical coherence tomography angiography devices.</w:t>
-      </w:r>
-      <w:r>
-        <w:t xml:space="preserve"> </w:t>
-      </w:r>
-      <w:r>
-        <w:rPr>
-          <w:i/>
-          <w:iCs/>
-        </w:rPr>
-        <w:t xml:space="preserve">Am. J. Ophthalmol.</w:t>
-      </w:r>
-      <w:r>
-        <w:t xml:space="preserve"> </w:t>
-      </w:r>
-      <w:r>
-        <w:t xml:space="preserve">186, 25–31 (2018).</w:t>
-      </w:r>
-    </w:p>
-    <w:p>
-      <w:pPr>
-        <w:pStyle w:val="Compact"/>
-        <w:numPr>
-          <w:ilvl w:val="0"/>
-          <w:numId w:val="1003"/>
-        </w:numPr>
-      </w:pPr>
-      <w:r>
-        <w:t xml:space="preserve">Corvi, F. et al. Comparison between several optical coherence tomography angiography devices and indocyanine green angiography of choroidal neovascularization.</w:t>
-      </w:r>
-      <w:r>
-        <w:t xml:space="preserve"> </w:t>
-      </w:r>
-      <w:r>
-        <w:rPr>
-          <w:i/>
-          <w:iCs/>
-        </w:rPr>
-        <w:t xml:space="preserve">Retina</w:t>
-      </w:r>
-      <w:r>
-        <w:t xml:space="preserve"> </w:t>
-      </w:r>
-      <w:r>
-        <w:t xml:space="preserve">40, 873–880 (2020).</w:t>
-      </w:r>
-    </w:p>
-    <w:p>
-      <w:pPr>
-        <w:pStyle w:val="Compact"/>
-        <w:numPr>
-          <w:ilvl w:val="0"/>
-          <w:numId w:val="1003"/>
-        </w:numPr>
-      </w:pPr>
-      <w:r>
-        <w:t xml:space="preserve">Gan, Y. et al. Novel quantitative OCTA biomarkers of choroidal neovascularization and associations with disease activity and etiology.</w:t>
-      </w:r>
-      <w:r>
-        <w:t xml:space="preserve"> </w:t>
-      </w:r>
-      <w:r>
-        <w:rPr>
-          <w:i/>
-          <w:iCs/>
-        </w:rPr>
-        <w:t xml:space="preserve">Transl. Vis. Sci. Technol.</w:t>
-      </w:r>
-      <w:r>
-        <w:t xml:space="preserve"> </w:t>
-      </w:r>
-      <w:r>
-        <w:t xml:space="preserve">15(3), 10 (2026).</w:t>
-      </w:r>
-    </w:p>
-    <w:p>
-      <w:pPr>
-        <w:pStyle w:val="Compact"/>
-        <w:numPr>
-          <w:ilvl w:val="0"/>
-          <w:numId w:val="1003"/>
-        </w:numPr>
-      </w:pPr>
-      <w:r>
-        <w:t xml:space="preserve">Hsu, C. R. et al. Combined quantitative and qualitative optical coherence tomography angiography biomarkers for predicting active neovascular age-related macular degeneration.</w:t>
-      </w:r>
-      <w:r>
-        <w:t xml:space="preserve"> </w:t>
-      </w:r>
-      <w:r>
-        <w:rPr>
-          <w:i/>
-          <w:iCs/>
-        </w:rPr>
-        <w:t xml:space="preserve">Sci. Rep.</w:t>
-      </w:r>
-      <w:r>
-        <w:t xml:space="preserve"> </w:t>
-      </w:r>
-      <w:r>
-        <w:t xml:space="preserve">11, 18068 (2021).</w:t>
-      </w:r>
-    </w:p>
-    <w:p>
-      <w:pPr>
-        <w:pStyle w:val="Compact"/>
-        <w:numPr>
-          <w:ilvl w:val="0"/>
-          <w:numId w:val="1003"/>
-        </w:numPr>
-      </w:pPr>
-      <w:r>
-        <w:t xml:space="preserve">Shrout, P. E. &amp; Fleiss, J. L. Intraclass correlations: uses in assessing rater reliability.</w:t>
-      </w:r>
-      <w:r>
-        <w:t xml:space="preserve"> </w:t>
-      </w:r>
-      <w:r>
-        <w:rPr>
-          <w:i/>
-          <w:iCs/>
-        </w:rPr>
-        <w:t xml:space="preserve">Psychol. Bull.</w:t>
-      </w:r>
-      <w:r>
-        <w:t xml:space="preserve"> </w:t>
-      </w:r>
-      <w:r>
-        <w:t xml:space="preserve">86, 420–428 (1979).</w:t>
-      </w:r>
-    </w:p>
-    <w:p>
-      <w:pPr>
-        <w:pStyle w:val="Compact"/>
-        <w:numPr>
-          <w:ilvl w:val="0"/>
-          <w:numId w:val="1003"/>
-        </w:numPr>
-      </w:pPr>
-      <w:r>
-        <w:t xml:space="preserve">McGraw, K. O. &amp; Wong, S. P. Forming inferences about some intraclass correlation coefficients.</w:t>
-      </w:r>
-      <w:r>
-        <w:t xml:space="preserve"> </w:t>
-      </w:r>
-      <w:r>
-        <w:rPr>
-          <w:i/>
-          <w:iCs/>
-        </w:rPr>
-        <w:t xml:space="preserve">Psychol. Methods</w:t>
-      </w:r>
-      <w:r>
-        <w:t xml:space="preserve"> </w:t>
-      </w:r>
-      <w:r>
-        <w:t xml:space="preserve">1, 30–46 (1996).</w:t>
-      </w:r>
-    </w:p>
-    <w:p>
-      <w:pPr>
-        <w:pStyle w:val="Compact"/>
-        <w:numPr>
-          <w:ilvl w:val="0"/>
-          <w:numId w:val="1003"/>
+          <w:numId w:val="1002"/>
         </w:numPr>
       </w:pPr>
       <w:r>
@@ -3781,36 +3038,6 @@
     </w:lvlOverride>
   </w:num>
   <w:num w:numId="1002">
-    <w:abstractNumId w:val="99411"/>
-    <w:lvlOverride w:ilvl="0">
-      <w:startOverride w:val="1"/>
-    </w:lvlOverride>
-    <w:lvlOverride w:ilvl="1">
-      <w:startOverride w:val="1"/>
-    </w:lvlOverride>
-    <w:lvlOverride w:ilvl="2">
-      <w:startOverride w:val="1"/>
-    </w:lvlOverride>
-    <w:lvlOverride w:ilvl="3">
-      <w:startOverride w:val="1"/>
-    </w:lvlOverride>
-    <w:lvlOverride w:ilvl="4">
-      <w:startOverride w:val="1"/>
-    </w:lvlOverride>
-    <w:lvlOverride w:ilvl="5">
-      <w:startOverride w:val="1"/>
-    </w:lvlOverride>
-    <w:lvlOverride w:ilvl="6">
-      <w:startOverride w:val="1"/>
-    </w:lvlOverride>
-    <w:lvlOverride w:ilvl="7">
-      <w:startOverride w:val="1"/>
-    </w:lvlOverride>
-    <w:lvlOverride w:ilvl="8">
-      <w:startOverride w:val="1"/>
-    </w:lvlOverride>
-  </w:num>
-  <w:num w:numId="1003">
     <w:abstractNumId w:val="99411"/>
     <w:lvlOverride w:ilvl="0">
       <w:startOverride w:val="1"/>

</xml_diff>

<commit_message>
Separate bibliography entries into one paragraph per reference in clean MS.
Co-authored-by: Cursor <cursoragent@cursor.com>
</commit_message>
<xml_diff>
--- a/documentation/graefe_revision/MNV_Analysis_YY_rev1.docx
+++ b/documentation/graefe_revision/MNV_Analysis_YY_rev1.docx
@@ -952,10 +952,13 @@
     </w:p>
     <w:p>
       <w:pPr>
-        <w:pStyle w:val="FirstParagraph"/>
-      </w:pPr>
-      <w:r>
-        <w:t xml:space="preserve">1. Guo, J., Tang, W., Xu, S., Liu, W. &amp; Xu, G. OCTA evaluation of treatment-naïve flat irregular PED (FIPED)-associated CNV in chronic central serous chorioretinopathy before and after half-dose PDT.</w:t>
+        <w:numPr>
+          <w:ilvl w:val="0"/>
+          <w:numId w:val="1004"/>
+        </w:numPr>
+      </w:pPr>
+      <w:r>
+        <w:t xml:space="preserve">Guo, J., Tang, W., Xu, S., Liu, W. &amp; Xu, G. OCTA evaluation of treatment-naïve flat irregular PED (FIPED)-associated CNV in chronic central serous chorioretinopathy before and after half-dose PDT.</w:t>
       </w:r>
       <w:r>
         <w:t xml:space="preserve"> </w:t>
@@ -973,11 +976,16 @@
       <w:r>
         <w:t xml:space="preserve">35, 2871–2878 (2021).</w:t>
       </w:r>
-      <w:r>
-        <w:t xml:space="preserve"> </w:t>
-      </w:r>
-      <w:r>
-        <w:t xml:space="preserve">2. Zudaire, E., Gambardella, L., Kurcz, C. &amp; Vermeren, S. A Computational Tool for Quantitative Analysis of Vascular Networks.</w:t>
+    </w:p>
+    <w:p>
+      <w:pPr>
+        <w:numPr>
+          <w:ilvl w:val="0"/>
+          <w:numId w:val="1004"/>
+        </w:numPr>
+      </w:pPr>
+      <w:r>
+        <w:t xml:space="preserve">Zudaire, E., Gambardella, L., Kurcz, C. &amp; Vermeren, S. A Computational Tool for Quantitative Analysis of Vascular Networks.</w:t>
       </w:r>
       <w:r>
         <w:t xml:space="preserve"> </w:t>
@@ -995,11 +1003,16 @@
       <w:r>
         <w:t xml:space="preserve">6, e27385 (2011).</w:t>
       </w:r>
-      <w:r>
-        <w:t xml:space="preserve"> </w:t>
-      </w:r>
-      <w:r>
-        <w:t xml:space="preserve">3. Told, R. et al. Profiling neovascular age-related macular degeneration choroidal neovascularization lesion response to anti-vascular endothelial growth factor therapy using SSOCTA.</w:t>
+    </w:p>
+    <w:p>
+      <w:pPr>
+        <w:numPr>
+          <w:ilvl w:val="0"/>
+          <w:numId w:val="1004"/>
+        </w:numPr>
+      </w:pPr>
+      <w:r>
+        <w:t xml:space="preserve">Told, R. et al. Profiling neovascular age-related macular degeneration choroidal neovascularization lesion response to anti-vascular endothelial growth factor therapy using SSOCTA.</w:t>
       </w:r>
       <w:r>
         <w:t xml:space="preserve"> </w:t>
@@ -1017,11 +1030,16 @@
       <w:r>
         <w:t xml:space="preserve">99, e240–e246 (2021).</w:t>
       </w:r>
-      <w:r>
-        <w:t xml:space="preserve"> </w:t>
-      </w:r>
-      <w:r>
-        <w:t xml:space="preserve">4. Montesel, A. et al. Quantitative response of macular neovascularisation to loading phase of aflibercept in neovascular age-related macular degeneration.</w:t>
+    </w:p>
+    <w:p>
+      <w:pPr>
+        <w:numPr>
+          <w:ilvl w:val="0"/>
+          <w:numId w:val="1004"/>
+        </w:numPr>
+      </w:pPr>
+      <w:r>
+        <w:t xml:space="preserve">Montesel, A. et al. Quantitative response of macular neovascularisation to loading phase of aflibercept in neovascular age-related macular degeneration.</w:t>
       </w:r>
       <w:r>
         <w:t xml:space="preserve"> </w:t>
@@ -1039,11 +1057,16 @@
       <w:r>
         <w:t xml:space="preserve">37, 3648–3655 (2023).</w:t>
       </w:r>
-      <w:r>
-        <w:t xml:space="preserve"> </w:t>
-      </w:r>
-      <w:r>
-        <w:t xml:space="preserve">5. Carlà, M. M. et al. MORPHOMETRIC CHANGES IN MACULAR NEOVASCULARIZATION ARCHITECTURE AFTER FARICIMAB TREATMENT IN NEOVASCULAR AGE-RELATED MACULAR DEGENERATION: Comparison Between Naive and Switched Eyes.</w:t>
+    </w:p>
+    <w:p>
+      <w:pPr>
+        <w:numPr>
+          <w:ilvl w:val="0"/>
+          <w:numId w:val="1004"/>
+        </w:numPr>
+      </w:pPr>
+      <w:r>
+        <w:t xml:space="preserve">Carlà, M. M. et al. MORPHOMETRIC CHANGES IN MACULAR NEOVASCULARIZATION ARCHITECTURE AFTER FARICIMAB TREATMENT IN NEOVASCULAR AGE-RELATED MACULAR DEGENERATION: Comparison Between Naive and Switched Eyes.</w:t>
       </w:r>
       <w:r>
         <w:t xml:space="preserve"> </w:t>
@@ -1061,11 +1084,16 @@
       <w:r>
         <w:t xml:space="preserve">125–135 (2026) doi:10.1097/iae.0000000000004635.</w:t>
       </w:r>
-      <w:r>
-        <w:t xml:space="preserve"> </w:t>
-      </w:r>
-      <w:r>
-        <w:t xml:space="preserve">6. Munk, M. R. et al. OCT-angiography: A qualitative and quantitative comparison of 4 OCT-A devices.</w:t>
+    </w:p>
+    <w:p>
+      <w:pPr>
+        <w:numPr>
+          <w:ilvl w:val="0"/>
+          <w:numId w:val="1004"/>
+        </w:numPr>
+      </w:pPr>
+      <w:r>
+        <w:t xml:space="preserve">Munk, M. R. et al. OCT-angiography: A qualitative and quantitative comparison of 4 OCT-A devices.</w:t>
       </w:r>
       <w:r>
         <w:t xml:space="preserve"> </w:t>
@@ -1083,11 +1111,16 @@
       <w:r>
         <w:t xml:space="preserve">12, e0177059 (2017).</w:t>
       </w:r>
-      <w:r>
-        <w:t xml:space="preserve"> </w:t>
-      </w:r>
-      <w:r>
-        <w:t xml:space="preserve">7. Miere, A. et al. VASCULAR REMODELING OF CHOROIDAL NEOVASCULARIZATION AFTER ANTI-VASCULAR ENDOTHELIAL GROWTH FACTOR THERAPY VISUALIZED ON OPTICAL COHERENCE TOMOGRAPHY ANGIOGRAPHY.</w:t>
+    </w:p>
+    <w:p>
+      <w:pPr>
+        <w:numPr>
+          <w:ilvl w:val="0"/>
+          <w:numId w:val="1004"/>
+        </w:numPr>
+      </w:pPr>
+      <w:r>
+        <w:t xml:space="preserve">Miere, A. et al. VASCULAR REMODELING OF CHOROIDAL NEOVASCULARIZATION AFTER ANTI-VASCULAR ENDOTHELIAL GROWTH FACTOR THERAPY VISUALIZED ON OPTICAL COHERENCE TOMOGRAPHY ANGIOGRAPHY.</w:t>
       </w:r>
       <w:r>
         <w:t xml:space="preserve"> </w:t>
@@ -1105,11 +1138,16 @@
       <w:r>
         <w:t xml:space="preserve">39, 548–557 (2019).</w:t>
       </w:r>
-      <w:r>
-        <w:t xml:space="preserve"> </w:t>
-      </w:r>
-      <w:r>
-        <w:t xml:space="preserve">8. Tew, T. B. et al. Comparison of different morphologies of choroidal neovascularization evaluated by ocular coherence tomography angiography in age-related macular degeneration.</w:t>
+    </w:p>
+    <w:p>
+      <w:pPr>
+        <w:numPr>
+          <w:ilvl w:val="0"/>
+          <w:numId w:val="1004"/>
+        </w:numPr>
+      </w:pPr>
+      <w:r>
+        <w:t xml:space="preserve">Tew, T. B. et al. Comparison of different morphologies of choroidal neovascularization evaluated by ocular coherence tomography angiography in age-related macular degeneration.</w:t>
       </w:r>
       <w:r>
         <w:t xml:space="preserve"> </w:t>
@@ -1127,11 +1165,16 @@
       <w:r>
         <w:t xml:space="preserve">48, 927–937 (2020).</w:t>
       </w:r>
-      <w:r>
-        <w:t xml:space="preserve"> </w:t>
-      </w:r>
-      <w:r>
-        <w:t xml:space="preserve">9. Oliveira, W. S., Teixeira, J. V., Ren, T. I., Cavalcanti, G. D. C. &amp; Sijbers, J. Unsupervised Retinal Vessel Segmentation Using Combined Filters.</w:t>
+    </w:p>
+    <w:p>
+      <w:pPr>
+        <w:numPr>
+          <w:ilvl w:val="0"/>
+          <w:numId w:val="1004"/>
+        </w:numPr>
+      </w:pPr>
+      <w:r>
+        <w:t xml:space="preserve">Oliveira, W. S., Teixeira, J. V., Ren, T. I., Cavalcanti, G. D. C. &amp; Sijbers, J. Unsupervised Retinal Vessel Segmentation Using Combined Filters.</w:t>
       </w:r>
       <w:r>
         <w:t xml:space="preserve"> </w:t>
@@ -1149,11 +1192,16 @@
       <w:r>
         <w:t xml:space="preserve">11, e0149943 (2016).</w:t>
       </w:r>
-      <w:r>
-        <w:t xml:space="preserve"> </w:t>
-      </w:r>
-      <w:r>
-        <w:t xml:space="preserve">10. Ma, Y. et al. Multichannel Retinal Blood Vessel Segmentation Based on the Combination of Matched Filter and U-Net Network.</w:t>
+    </w:p>
+    <w:p>
+      <w:pPr>
+        <w:numPr>
+          <w:ilvl w:val="0"/>
+          <w:numId w:val="1004"/>
+        </w:numPr>
+      </w:pPr>
+      <w:r>
+        <w:t xml:space="preserve">Ma, Y. et al. Multichannel Retinal Blood Vessel Segmentation Based on the Combination of Matched Filter and U-Net Network.</w:t>
       </w:r>
       <w:r>
         <w:t xml:space="preserve"> </w:t>
@@ -1171,11 +1219,16 @@
       <w:r>
         <w:t xml:space="preserve">2021, 5561125 (2021).</w:t>
       </w:r>
-      <w:r>
-        <w:t xml:space="preserve"> </w:t>
-      </w:r>
-      <w:r>
-        <w:t xml:space="preserve">11. Memari, N., Ramli, A. R., Bin Saripan, M. I., Mashohor, S. &amp; Moghbel, M. Supervised retinal vessel segmentation from color fundus images based on matched filtering and AdaBoost classifier.</w:t>
+    </w:p>
+    <w:p>
+      <w:pPr>
+        <w:numPr>
+          <w:ilvl w:val="0"/>
+          <w:numId w:val="1004"/>
+        </w:numPr>
+      </w:pPr>
+      <w:r>
+        <w:t xml:space="preserve">Memari, N., Ramli, A. R., Bin Saripan, M. I., Mashohor, S. &amp; Moghbel, M. Supervised retinal vessel segmentation from color fundus images based on matched filtering and AdaBoost classifier.</w:t>
       </w:r>
       <w:r>
         <w:t xml:space="preserve"> </w:t>
@@ -1193,11 +1246,16 @@
       <w:r>
         <w:t xml:space="preserve">12, e0188939 (2017).</w:t>
       </w:r>
-      <w:r>
-        <w:t xml:space="preserve"> </w:t>
-      </w:r>
-      <w:r>
-        <w:t xml:space="preserve">12. Coscas, F. et al. Optical coherence tomography angiography in exudative age-related macular degeneration: A predictive model for treatment decisions.</w:t>
+    </w:p>
+    <w:p>
+      <w:pPr>
+        <w:numPr>
+          <w:ilvl w:val="0"/>
+          <w:numId w:val="1004"/>
+        </w:numPr>
+      </w:pPr>
+      <w:r>
+        <w:t xml:space="preserve">Coscas, F. et al. Optical coherence tomography angiography in exudative age-related macular degeneration: A predictive model for treatment decisions.</w:t>
       </w:r>
       <w:r>
         <w:t xml:space="preserve"> </w:t>
@@ -1215,11 +1273,16 @@
       <w:r>
         <w:t xml:space="preserve">103, 1342–1356 (2019).</w:t>
       </w:r>
-      <w:r>
-        <w:t xml:space="preserve"> </w:t>
-      </w:r>
-      <w:r>
-        <w:t xml:space="preserve">13. Shrout, P. E. &amp; Fleiss, J. L. Intraclass correlations: uses in assessing rater reliability.</w:t>
+    </w:p>
+    <w:p>
+      <w:pPr>
+        <w:numPr>
+          <w:ilvl w:val="0"/>
+          <w:numId w:val="1004"/>
+        </w:numPr>
+      </w:pPr>
+      <w:r>
+        <w:t xml:space="preserve">Shrout, P. E. &amp; Fleiss, J. L. Intraclass correlations: uses in assessing rater reliability.</w:t>
       </w:r>
       <w:r>
         <w:t xml:space="preserve"> </w:t>
@@ -1237,11 +1300,16 @@
       <w:r>
         <w:t xml:space="preserve">86, 420–428 (1979).</w:t>
       </w:r>
-      <w:r>
-        <w:t xml:space="preserve"> </w:t>
-      </w:r>
-      <w:r>
-        <w:t xml:space="preserve">14. McGraw, K. O. &amp; Wong, S. P. Forming inferences about some intraclass correlation coefficients.</w:t>
+    </w:p>
+    <w:p>
+      <w:pPr>
+        <w:numPr>
+          <w:ilvl w:val="0"/>
+          <w:numId w:val="1004"/>
+        </w:numPr>
+      </w:pPr>
+      <w:r>
+        <w:t xml:space="preserve">McGraw, K. O. &amp; Wong, S. P. Forming inferences about some intraclass correlation coefficients.</w:t>
       </w:r>
       <w:r>
         <w:t xml:space="preserve"> </w:t>
@@ -1259,11 +1327,16 @@
       <w:r>
         <w:t xml:space="preserve">1, 30–46 (1996).</w:t>
       </w:r>
-      <w:r>
-        <w:t xml:space="preserve"> </w:t>
-      </w:r>
-      <w:r>
-        <w:t xml:space="preserve">15. Koo, T. K. &amp; Li, M. Y. A guideline of selecting and reporting intraclass correlation coefficients for reliability research.</w:t>
+    </w:p>
+    <w:p>
+      <w:pPr>
+        <w:numPr>
+          <w:ilvl w:val="0"/>
+          <w:numId w:val="1004"/>
+        </w:numPr>
+      </w:pPr>
+      <w:r>
+        <w:t xml:space="preserve">Koo, T. K. &amp; Li, M. Y. A guideline of selecting and reporting intraclass correlation coefficients for reliability research.</w:t>
       </w:r>
       <w:r>
         <w:t xml:space="preserve"> </w:t>
@@ -1281,11 +1354,16 @@
       <w:r>
         <w:t xml:space="preserve">15, 155–163 (2016).</w:t>
       </w:r>
-      <w:r>
-        <w:t xml:space="preserve"> </w:t>
-      </w:r>
-      <w:r>
-        <w:t xml:space="preserve">16. Corvi, F. et al. Reproducibility of vessel density, fractal dimension, and foveal avascular zone using 7 different optical coherence tomography angiography devices.</w:t>
+    </w:p>
+    <w:p>
+      <w:pPr>
+        <w:numPr>
+          <w:ilvl w:val="0"/>
+          <w:numId w:val="1004"/>
+        </w:numPr>
+      </w:pPr>
+      <w:r>
+        <w:t xml:space="preserve">Corvi, F. et al. Reproducibility of vessel density, fractal dimension, and foveal avascular zone using 7 different optical coherence tomography angiography devices.</w:t>
       </w:r>
       <w:r>
         <w:t xml:space="preserve"> </w:t>
@@ -1303,11 +1381,16 @@
       <w:r>
         <w:t xml:space="preserve">186, 25–31 (2018).</w:t>
       </w:r>
-      <w:r>
-        <w:t xml:space="preserve"> </w:t>
-      </w:r>
-      <w:r>
-        <w:t xml:space="preserve">17. Corvi, F. et al. Comparison between several optical coherence tomography angiography devices and indocyanine green angiography of choroidal neovascularization.</w:t>
+    </w:p>
+    <w:p>
+      <w:pPr>
+        <w:numPr>
+          <w:ilvl w:val="0"/>
+          <w:numId w:val="1004"/>
+        </w:numPr>
+      </w:pPr>
+      <w:r>
+        <w:t xml:space="preserve">Corvi, F. et al. Comparison between several optical coherence tomography angiography devices and indocyanine green angiography of choroidal neovascularization.</w:t>
       </w:r>
       <w:r>
         <w:t xml:space="preserve"> </w:t>
@@ -1325,11 +1408,16 @@
       <w:r>
         <w:t xml:space="preserve">40, 873–880 (2020).</w:t>
       </w:r>
-      <w:r>
-        <w:t xml:space="preserve"> </w:t>
-      </w:r>
-      <w:r>
-        <w:t xml:space="preserve">18. Wang, M. et al. Evaluating Polypoidal Choroidal Vasculopathy With Optical Coherence Tomography Angiography.</w:t>
+    </w:p>
+    <w:p>
+      <w:pPr>
+        <w:numPr>
+          <w:ilvl w:val="0"/>
+          <w:numId w:val="1004"/>
+        </w:numPr>
+      </w:pPr>
+      <w:r>
+        <w:t xml:space="preserve">Wang, M. et al. Evaluating Polypoidal Choroidal Vasculopathy With Optical Coherence Tomography Angiography.</w:t>
       </w:r>
       <w:r>
         <w:t xml:space="preserve"> </w:t>
@@ -1347,11 +1435,16 @@
       <w:r>
         <w:t xml:space="preserve">57, OCT526-32 (2016).</w:t>
       </w:r>
-      <w:r>
-        <w:t xml:space="preserve"> </w:t>
-      </w:r>
-      <w:r>
-        <w:t xml:space="preserve">19. Xue, J. et al. Automatic quantification of choroidal neovascularization lesion area on OCT angiography based on density cell-like P systems with active membranes.</w:t>
+    </w:p>
+    <w:p>
+      <w:pPr>
+        <w:numPr>
+          <w:ilvl w:val="0"/>
+          <w:numId w:val="1004"/>
+        </w:numPr>
+      </w:pPr>
+      <w:r>
+        <w:t xml:space="preserve">Xue, J. et al. Automatic quantification of choroidal neovascularization lesion area on OCT angiography based on density cell-like P systems with active membranes.</w:t>
       </w:r>
       <w:r>
         <w:t xml:space="preserve"> </w:t>
@@ -1369,11 +1462,16 @@
       <w:r>
         <w:t xml:space="preserve">9, 3208–3219 (2018).</w:t>
       </w:r>
-      <w:r>
-        <w:t xml:space="preserve"> </w:t>
-      </w:r>
-      <w:r>
-        <w:t xml:space="preserve">20. Babiuch, A. et al. IMPACT OF OPTICAL COHERENCE TOMOGRAPHY ANGIOGRAPHY REVIEW STRATEGY ON DETECTION OF CHOROIDAL NEOVASCULARIZATION.</w:t>
+    </w:p>
+    <w:p>
+      <w:pPr>
+        <w:numPr>
+          <w:ilvl w:val="0"/>
+          <w:numId w:val="1004"/>
+        </w:numPr>
+      </w:pPr>
+      <w:r>
+        <w:t xml:space="preserve">Babiuch, A. et al. IMPACT OF OPTICAL COHERENCE TOMOGRAPHY ANGIOGRAPHY REVIEW STRATEGY ON DETECTION OF CHOROIDAL NEOVASCULARIZATION.</w:t>
       </w:r>
       <w:r>
         <w:t xml:space="preserve"> </w:t>
@@ -1391,11 +1489,16 @@
       <w:r>
         <w:t xml:space="preserve">672–678 (2020) doi:10.1097/iae.0000000000002443.</w:t>
       </w:r>
-      <w:r>
-        <w:t xml:space="preserve"> </w:t>
-      </w:r>
-      <w:r>
-        <w:t xml:space="preserve">21. Smith, A. &amp; Zavala, V. The Euler characteristic: A general topological descriptor for complex data.</w:t>
+    </w:p>
+    <w:p>
+      <w:pPr>
+        <w:numPr>
+          <w:ilvl w:val="0"/>
+          <w:numId w:val="1004"/>
+        </w:numPr>
+      </w:pPr>
+      <w:r>
+        <w:t xml:space="preserve">Smith, A. &amp; Zavala, V. The Euler characteristic: A general topological descriptor for complex data.</w:t>
       </w:r>
       <w:r>
         <w:t xml:space="preserve"> </w:t>
@@ -1413,11 +1516,16 @@
       <w:r>
         <w:t xml:space="preserve">154, 107463 (2021).</w:t>
       </w:r>
-      <w:r>
-        <w:t xml:space="preserve"> </w:t>
-      </w:r>
-      <w:r>
-        <w:t xml:space="preserve">22. Willführ, A. et al. Estimation of the number of alveolar capillaries by the Euler number (Euler-Poincaré characteristic).</w:t>
+    </w:p>
+    <w:p>
+      <w:pPr>
+        <w:numPr>
+          <w:ilvl w:val="0"/>
+          <w:numId w:val="1004"/>
+        </w:numPr>
+      </w:pPr>
+      <w:r>
+        <w:t xml:space="preserve">Willführ, A. et al. Estimation of the number of alveolar capillaries by the Euler number (Euler-Poincaré characteristic).</w:t>
       </w:r>
       <w:r>
         <w:t xml:space="preserve"> </w:t>
@@ -1435,11 +1543,16 @@
       <w:r>
         <w:t xml:space="preserve">309, L1286-93 (2015).</w:t>
       </w:r>
-      <w:r>
-        <w:t xml:space="preserve"> </w:t>
-      </w:r>
-      <w:r>
-        <w:t xml:space="preserve">23. Santos, F. et al. Topological phase transitions in functional brain networks.</w:t>
+    </w:p>
+    <w:p>
+      <w:pPr>
+        <w:numPr>
+          <w:ilvl w:val="0"/>
+          <w:numId w:val="1004"/>
+        </w:numPr>
+      </w:pPr>
+      <w:r>
+        <w:t xml:space="preserve">Santos, F. et al. Topological phase transitions in functional brain networks.</w:t>
       </w:r>
       <w:r>
         <w:t xml:space="preserve"> </w:t>
@@ -1457,11 +1570,16 @@
       <w:r>
         <w:t xml:space="preserve">https://doi.org/10.1101/469478 (2018) doi:10.1101/469478.</w:t>
       </w:r>
-      <w:r>
-        <w:t xml:space="preserve"> </w:t>
-      </w:r>
-      <w:r>
-        <w:t xml:space="preserve">24. Viallard, C. &amp; Larrivée, B. Tumor angiogenesis and vascular normalization: alternative therapeutic targets.</w:t>
+    </w:p>
+    <w:p>
+      <w:pPr>
+        <w:numPr>
+          <w:ilvl w:val="0"/>
+          <w:numId w:val="1004"/>
+        </w:numPr>
+      </w:pPr>
+      <w:r>
+        <w:t xml:space="preserve">Viallard, C. &amp; Larrivée, B. Tumor angiogenesis and vascular normalization: alternative therapeutic targets.</w:t>
       </w:r>
       <w:r>
         <w:t xml:space="preserve"> </w:t>
@@ -1479,11 +1597,16 @@
       <w:r>
         <w:t xml:space="preserve">20, 409–426 (2017).</w:t>
       </w:r>
-      <w:r>
-        <w:t xml:space="preserve"> </w:t>
-      </w:r>
-      <w:r>
-        <w:t xml:space="preserve">25. Goker, Y. S. &amp; Demir, G. Comparison of optical coherence tomography angiography features in type 1 versus type 2 choroidal neovascular membranes secondary to age-related macular degeneration.</w:t>
+    </w:p>
+    <w:p>
+      <w:pPr>
+        <w:numPr>
+          <w:ilvl w:val="0"/>
+          <w:numId w:val="1004"/>
+        </w:numPr>
+      </w:pPr>
+      <w:r>
+        <w:t xml:space="preserve">Goker, Y. S. &amp; Demir, G. Comparison of optical coherence tomography angiography features in type 1 versus type 2 choroidal neovascular membranes secondary to age-related macular degeneration.</w:t>
       </w:r>
       <w:r>
         <w:t xml:space="preserve"> </w:t>
@@ -1501,11 +1624,16 @@
       <w:r>
         <w:t xml:space="preserve">10, 67–73 (2021).</w:t>
       </w:r>
-      <w:r>
-        <w:t xml:space="preserve"> </w:t>
-      </w:r>
-      <w:r>
-        <w:t xml:space="preserve">26. Li, J. et al. Comparative quantitative analysis of optical coherence tomography angiography in varied morphologies of macular neovascularization following intravitreal conbercept and ranibizumab treatments for neovascular age‑related macular degeneration.</w:t>
+    </w:p>
+    <w:p>
+      <w:pPr>
+        <w:numPr>
+          <w:ilvl w:val="0"/>
+          <w:numId w:val="1004"/>
+        </w:numPr>
+      </w:pPr>
+      <w:r>
+        <w:t xml:space="preserve">Li, J. et al. Comparative quantitative analysis of optical coherence tomography angiography in varied morphologies of macular neovascularization following intravitreal conbercept and ranibizumab treatments for neovascular age‑related macular degeneration.</w:t>
       </w:r>
       <w:r>
         <w:t xml:space="preserve"> </w:t>
@@ -1523,11 +1651,16 @@
       <w:r>
         <w:t xml:space="preserve">27, 214 (2024).</w:t>
       </w:r>
-      <w:r>
-        <w:t xml:space="preserve"> </w:t>
-      </w:r>
-      <w:r>
-        <w:t xml:space="preserve">27. Mettu, P. S., Allingham, M. J. &amp; Cousins, S. W. Incomplete response to Anti-VEGF therapy in neovascular AMD: Exploring disease mechanisms and therapeutic opportunities.</w:t>
+    </w:p>
+    <w:p>
+      <w:pPr>
+        <w:numPr>
+          <w:ilvl w:val="0"/>
+          <w:numId w:val="1004"/>
+        </w:numPr>
+      </w:pPr>
+      <w:r>
+        <w:t xml:space="preserve">Mettu, P. S., Allingham, M. J. &amp; Cousins, S. W. Incomplete response to Anti-VEGF therapy in neovascular AMD: Exploring disease mechanisms and therapeutic opportunities.</w:t>
       </w:r>
       <w:r>
         <w:t xml:space="preserve"> </w:t>
@@ -1545,11 +1678,16 @@
       <w:r>
         <w:t xml:space="preserve">82, 100906 (2021).</w:t>
       </w:r>
-      <w:r>
-        <w:t xml:space="preserve"> </w:t>
-      </w:r>
-      <w:r>
-        <w:t xml:space="preserve">28. Attarde, A., Riad, T., Zhang, Z., Ahir, M. &amp; Fu, Y. Characterization of Vascular Morphology of Neovascular Age-Related Macular Degeneration by Indocyanine Green Angiography.</w:t>
+    </w:p>
+    <w:p>
+      <w:pPr>
+        <w:numPr>
+          <w:ilvl w:val="0"/>
+          <w:numId w:val="1004"/>
+        </w:numPr>
+      </w:pPr>
+      <w:r>
+        <w:t xml:space="preserve">Attarde, A., Riad, T., Zhang, Z., Ahir, M. &amp; Fu, Y. Characterization of Vascular Morphology of Neovascular Age-Related Macular Degeneration by Indocyanine Green Angiography.</w:t>
       </w:r>
       <w:r>
         <w:t xml:space="preserve"> </w:t>
@@ -1567,11 +1705,16 @@
       <w:r>
         <w:t xml:space="preserve">198, (2023).</w:t>
       </w:r>
-      <w:r>
-        <w:t xml:space="preserve"> </w:t>
-      </w:r>
-      <w:r>
-        <w:t xml:space="preserve">29. Fu, Y., Zhang, Z., Webster, K. &amp; Paulus, Y. Treatment Strategies for Anti-VEGF Resistance in Neovascular Age-Related Macular Degeneration by Targeting Arteriolar Choroidal Neovascularization.</w:t>
+    </w:p>
+    <w:p>
+      <w:pPr>
+        <w:numPr>
+          <w:ilvl w:val="0"/>
+          <w:numId w:val="1004"/>
+        </w:numPr>
+      </w:pPr>
+      <w:r>
+        <w:t xml:space="preserve">Fu, Y., Zhang, Z., Webster, K. &amp; Paulus, Y. Treatment Strategies for Anti-VEGF Resistance in Neovascular Age-Related Macular Degeneration by Targeting Arteriolar Choroidal Neovascularization.</w:t>
       </w:r>
       <w:r>
         <w:t xml:space="preserve"> </w:t>
@@ -1589,11 +1732,16 @@
       <w:r>
         <w:t xml:space="preserve">14, 252 (2024).</w:t>
       </w:r>
-      <w:r>
-        <w:t xml:space="preserve"> </w:t>
-      </w:r>
-      <w:r>
-        <w:t xml:space="preserve">30. Spaide, R. Optical Coherence Tomography Angiography Signs of Vascular Abnormalization With Antiangiogenic Therapy for Choroidal Neovascularization.</w:t>
+    </w:p>
+    <w:p>
+      <w:pPr>
+        <w:numPr>
+          <w:ilvl w:val="0"/>
+          <w:numId w:val="1004"/>
+        </w:numPr>
+      </w:pPr>
+      <w:r>
+        <w:t xml:space="preserve">Spaide, R. Optical Coherence Tomography Angiography Signs of Vascular Abnormalization With Antiangiogenic Therapy for Choroidal Neovascularization.</w:t>
       </w:r>
       <w:r>
         <w:t xml:space="preserve"> </w:t>
@@ -1611,11 +1759,16 @@
       <w:r>
         <w:t xml:space="preserve">160, 6–16 (2015).</w:t>
       </w:r>
-      <w:r>
-        <w:t xml:space="preserve"> </w:t>
-      </w:r>
-      <w:r>
-        <w:t xml:space="preserve">31. Shah, P. N. et al. Inter-rater reliability of proliferative diabetic retinopathy assessment on wide-field OCT-angiography and fluorescein angiography.</w:t>
+    </w:p>
+    <w:p>
+      <w:pPr>
+        <w:numPr>
+          <w:ilvl w:val="0"/>
+          <w:numId w:val="1004"/>
+        </w:numPr>
+      </w:pPr>
+      <w:r>
+        <w:t xml:space="preserve">Shah, P. N. et al. Inter-rater reliability of proliferative diabetic retinopathy assessment on wide-field OCT-angiography and fluorescein angiography.</w:t>
       </w:r>
       <w:r>
         <w:t xml:space="preserve"> </w:t>
@@ -1633,11 +1786,16 @@
       <w:r>
         <w:t xml:space="preserve">12(7), 13 (2023).</w:t>
       </w:r>
-      <w:r>
-        <w:t xml:space="preserve"> </w:t>
-      </w:r>
-      <w:r>
-        <w:t xml:space="preserve">32. Deák, G. G. et al. Comparison of optical coherence tomography vs. fluorescein angiography-based macular neovascularization classifications in age-related macular degeneration.</w:t>
+    </w:p>
+    <w:p>
+      <w:pPr>
+        <w:numPr>
+          <w:ilvl w:val="0"/>
+          <w:numId w:val="1004"/>
+        </w:numPr>
+      </w:pPr>
+      <w:r>
+        <w:t xml:space="preserve">Deák, G. G. et al. Comparison of optical coherence tomography vs. fluorescein angiography-based macular neovascularization classifications in age-related macular degeneration.</w:t>
       </w:r>
       <w:r>
         <w:t xml:space="preserve"> </w:t>
@@ -1655,11 +1813,16 @@
       <w:r>
         <w:t xml:space="preserve">15, 4303 (2025) doi:10.1038/s41598-025-87576-6.</w:t>
       </w:r>
-      <w:r>
-        <w:t xml:space="preserve"> </w:t>
-      </w:r>
-      <w:r>
-        <w:t xml:space="preserve">33. Gan, Y. et al. Novel quantitative OCTA biomarkers of choroidal neovascularization and associations with disease activity and etiology.</w:t>
+    </w:p>
+    <w:p>
+      <w:pPr>
+        <w:numPr>
+          <w:ilvl w:val="0"/>
+          <w:numId w:val="1004"/>
+        </w:numPr>
+      </w:pPr>
+      <w:r>
+        <w:t xml:space="preserve">Gan, Y. et al. Novel quantitative OCTA biomarkers of choroidal neovascularization and associations with disease activity and etiology.</w:t>
       </w:r>
       <w:r>
         <w:t xml:space="preserve"> </w:t>
@@ -1677,11 +1840,16 @@
       <w:r>
         <w:t xml:space="preserve">15(3), 10 (2026).</w:t>
       </w:r>
-      <w:r>
-        <w:t xml:space="preserve"> </w:t>
-      </w:r>
-      <w:r>
-        <w:t xml:space="preserve">34. Hsu, C. R. et al. Combined quantitative and qualitative optical coherence tomography angiography biomarkers for predicting active neovascular age-related macular degeneration.</w:t>
+    </w:p>
+    <w:p>
+      <w:pPr>
+        <w:numPr>
+          <w:ilvl w:val="0"/>
+          <w:numId w:val="1004"/>
+        </w:numPr>
+      </w:pPr>
+      <w:r>
+        <w:t xml:space="preserve">Hsu, C. R. et al. Combined quantitative and qualitative optical coherence tomography angiography biomarkers for predicting active neovascular age-related macular degeneration.</w:t>
       </w:r>
       <w:r>
         <w:t xml:space="preserve"> </w:t>
@@ -2040,6 +2208,36 @@
     <w:abstractNumId w:val="991"/>
   </w:num>
   <w:num w:numId="1003">
+    <w:abstractNumId w:val="99411"/>
+    <w:lvlOverride w:ilvl="0">
+      <w:startOverride w:val="1"/>
+    </w:lvlOverride>
+    <w:lvlOverride w:ilvl="1">
+      <w:startOverride w:val="1"/>
+    </w:lvlOverride>
+    <w:lvlOverride w:ilvl="2">
+      <w:startOverride w:val="1"/>
+    </w:lvlOverride>
+    <w:lvlOverride w:ilvl="3">
+      <w:startOverride w:val="1"/>
+    </w:lvlOverride>
+    <w:lvlOverride w:ilvl="4">
+      <w:startOverride w:val="1"/>
+    </w:lvlOverride>
+    <w:lvlOverride w:ilvl="5">
+      <w:startOverride w:val="1"/>
+    </w:lvlOverride>
+    <w:lvlOverride w:ilvl="6">
+      <w:startOverride w:val="1"/>
+    </w:lvlOverride>
+    <w:lvlOverride w:ilvl="7">
+      <w:startOverride w:val="1"/>
+    </w:lvlOverride>
+    <w:lvlOverride w:ilvl="8">
+      <w:startOverride w:val="1"/>
+    </w:lvlOverride>
+  </w:num>
+  <w:num w:numId="1004">
     <w:abstractNumId w:val="99411"/>
     <w:lvlOverride w:ilvl="0">
       <w:startOverride w:val="1"/>
@@ -3008,7 +3206,7 @@
     </a:clrScheme>
     <a:fontScheme name="Office">
       <a:majorFont>
-        <a:latin typeface="Aptos Display" panose="02110004020202020204"/>
+        <a:latin typeface="Arial" panose="02110004020202020204"/>
         <a:ea typeface=""/>
         <a:cs typeface=""/>
         <a:font script="Jpan" typeface="游ゴシック Light"/>
@@ -3060,7 +3258,7 @@
         <a:font script="Tfng" typeface="Ebrima"/>
       </a:majorFont>
       <a:minorFont>
-        <a:latin typeface="Aptos" panose="02110004020202020204"/>
+        <a:latin typeface="Arial" panose="02110004020202020204"/>
         <a:ea typeface=""/>
         <a:cs typeface=""/>
         <a:font script="Jpan" typeface="游明朝"/>

</xml_diff>